<commit_message>
Lui lich theo trang tien do: khoi dong tuan 8, khao sat tuan 9, Moc 1 ngay 01/11
</commit_message>
<xml_diff>
--- a/bao-cao/BaoCao_TienDo_Nhom4_PTTKHTTT.docx
+++ b/bao-cao/BaoCao_TienDo_Nhom4_PTTKHTTT.docx
@@ -536,7 +536,7 @@
       <w:r>
         <w:fldChar w:fldCharType="separate"/>
       </w:r>
-      <w:hyperlink w:anchor="_Toc242250820" w:history="1">
+      <w:hyperlink w:anchor="_Toc242251478" w:history="1">
         <w:r>
           <w:rPr>
             <w:rStyle w:val="Hyperlink"/>
@@ -563,7 +563,7 @@
             <w:noProof/>
             <w:webHidden/>
           </w:rPr>
-          <w:instrText xml:space="preserve"> PAGEREF _Toc242250820 \h </w:instrText>
+          <w:instrText xml:space="preserve"> PAGEREF _Toc242251478 \h </w:instrText>
         </w:r>
         <w:r>
           <w:rPr>
@@ -607,7 +607,7 @@
           <w:szCs w:val="24"/>
         </w:rPr>
       </w:pPr>
-      <w:hyperlink w:anchor="_Toc242250821" w:history="1">
+      <w:hyperlink w:anchor="_Toc242251479" w:history="1">
         <w:r>
           <w:rPr>
             <w:rStyle w:val="Hyperlink"/>
@@ -634,7 +634,7 @@
             <w:noProof/>
             <w:webHidden/>
           </w:rPr>
-          <w:instrText xml:space="preserve"> PAGEREF _Toc242250821 \h </w:instrText>
+          <w:instrText xml:space="preserve"> PAGEREF _Toc242251479 \h </w:instrText>
         </w:r>
         <w:r>
           <w:rPr>
@@ -678,7 +678,7 @@
           <w:szCs w:val="24"/>
         </w:rPr>
       </w:pPr>
-      <w:hyperlink w:anchor="_Toc242250822" w:history="1">
+      <w:hyperlink w:anchor="_Toc242251480" w:history="1">
         <w:r>
           <w:rPr>
             <w:rStyle w:val="Hyperlink"/>
@@ -705,7 +705,7 @@
             <w:noProof/>
             <w:webHidden/>
           </w:rPr>
-          <w:instrText xml:space="preserve"> PAGEREF _Toc242250822 \h </w:instrText>
+          <w:instrText xml:space="preserve"> PAGEREF _Toc242251480 \h </w:instrText>
         </w:r>
         <w:r>
           <w:rPr>
@@ -749,7 +749,7 @@
           <w:szCs w:val="24"/>
         </w:rPr>
       </w:pPr>
-      <w:hyperlink w:anchor="_Toc242250823" w:history="1">
+      <w:hyperlink w:anchor="_Toc242251481" w:history="1">
         <w:r>
           <w:rPr>
             <w:rStyle w:val="Hyperlink"/>
@@ -776,7 +776,7 @@
             <w:noProof/>
             <w:webHidden/>
           </w:rPr>
-          <w:instrText xml:space="preserve"> PAGEREF _Toc242250823 \h </w:instrText>
+          <w:instrText xml:space="preserve"> PAGEREF _Toc242251481 \h </w:instrText>
         </w:r>
         <w:r>
           <w:rPr>
@@ -820,7 +820,7 @@
           <w:szCs w:val="24"/>
         </w:rPr>
       </w:pPr>
-      <w:hyperlink w:anchor="_Toc242250824" w:history="1">
+      <w:hyperlink w:anchor="_Toc242251482" w:history="1">
         <w:r>
           <w:rPr>
             <w:rStyle w:val="Hyperlink"/>
@@ -847,7 +847,7 @@
             <w:noProof/>
             <w:webHidden/>
           </w:rPr>
-          <w:instrText xml:space="preserve"> PAGEREF _Toc242250824 \h </w:instrText>
+          <w:instrText xml:space="preserve"> PAGEREF _Toc242251482 \h </w:instrText>
         </w:r>
         <w:r>
           <w:rPr>
@@ -891,7 +891,7 @@
           <w:szCs w:val="24"/>
         </w:rPr>
       </w:pPr>
-      <w:hyperlink w:anchor="_Toc242250825" w:history="1">
+      <w:hyperlink w:anchor="_Toc242251483" w:history="1">
         <w:r>
           <w:rPr>
             <w:rStyle w:val="Hyperlink"/>
@@ -918,7 +918,7 @@
             <w:noProof/>
             <w:webHidden/>
           </w:rPr>
-          <w:instrText xml:space="preserve"> PAGEREF _Toc242250825 \h </w:instrText>
+          <w:instrText xml:space="preserve"> PAGEREF _Toc242251483 \h </w:instrText>
         </w:r>
         <w:r>
           <w:rPr>
@@ -962,7 +962,7 @@
           <w:szCs w:val="24"/>
         </w:rPr>
       </w:pPr>
-      <w:hyperlink w:anchor="_Toc242250826" w:history="1">
+      <w:hyperlink w:anchor="_Toc242251484" w:history="1">
         <w:r>
           <w:rPr>
             <w:rStyle w:val="Hyperlink"/>
@@ -989,7 +989,7 @@
             <w:noProof/>
             <w:webHidden/>
           </w:rPr>
-          <w:instrText xml:space="preserve"> PAGEREF _Toc242250826 \h </w:instrText>
+          <w:instrText xml:space="preserve"> PAGEREF _Toc242251484 \h </w:instrText>
         </w:r>
         <w:r>
           <w:rPr>
@@ -1033,7 +1033,7 @@
           <w:szCs w:val="24"/>
         </w:rPr>
       </w:pPr>
-      <w:hyperlink w:anchor="_Toc242250827" w:history="1">
+      <w:hyperlink w:anchor="_Toc242251485" w:history="1">
         <w:r>
           <w:rPr>
             <w:rStyle w:val="Hyperlink"/>
@@ -1060,7 +1060,7 @@
             <w:noProof/>
             <w:webHidden/>
           </w:rPr>
-          <w:instrText xml:space="preserve"> PAGEREF _Toc242250827 \h </w:instrText>
+          <w:instrText xml:space="preserve"> PAGEREF _Toc242251485 \h </w:instrText>
         </w:r>
         <w:r>
           <w:rPr>
@@ -1104,7 +1104,7 @@
           <w:szCs w:val="24"/>
         </w:rPr>
       </w:pPr>
-      <w:hyperlink w:anchor="_Toc242250828" w:history="1">
+      <w:hyperlink w:anchor="_Toc242251486" w:history="1">
         <w:r>
           <w:rPr>
             <w:rStyle w:val="Hyperlink"/>
@@ -1131,7 +1131,7 @@
             <w:noProof/>
             <w:webHidden/>
           </w:rPr>
-          <w:instrText xml:space="preserve"> PAGEREF _Toc242250828 \h </w:instrText>
+          <w:instrText xml:space="preserve"> PAGEREF _Toc242251486 \h </w:instrText>
         </w:r>
         <w:r>
           <w:rPr>
@@ -1175,7 +1175,7 @@
           <w:szCs w:val="24"/>
         </w:rPr>
       </w:pPr>
-      <w:hyperlink w:anchor="_Toc242250829" w:history="1">
+      <w:hyperlink w:anchor="_Toc242251487" w:history="1">
         <w:r>
           <w:rPr>
             <w:rStyle w:val="Hyperlink"/>
@@ -1202,7 +1202,7 @@
             <w:noProof/>
             <w:webHidden/>
           </w:rPr>
-          <w:instrText xml:space="preserve"> PAGEREF _Toc242250829 \h </w:instrText>
+          <w:instrText xml:space="preserve"> PAGEREF _Toc242251487 \h </w:instrText>
         </w:r>
         <w:r>
           <w:rPr>
@@ -1246,7 +1246,7 @@
           <w:szCs w:val="24"/>
         </w:rPr>
       </w:pPr>
-      <w:hyperlink w:anchor="_Toc242250830" w:history="1">
+      <w:hyperlink w:anchor="_Toc242251488" w:history="1">
         <w:r>
           <w:rPr>
             <w:rStyle w:val="Hyperlink"/>
@@ -1273,7 +1273,7 @@
             <w:noProof/>
             <w:webHidden/>
           </w:rPr>
-          <w:instrText xml:space="preserve"> PAGEREF _Toc242250830 \h </w:instrText>
+          <w:instrText xml:space="preserve"> PAGEREF _Toc242251488 \h </w:instrText>
         </w:r>
         <w:r>
           <w:rPr>
@@ -1317,7 +1317,7 @@
           <w:szCs w:val="24"/>
         </w:rPr>
       </w:pPr>
-      <w:hyperlink w:anchor="_Toc242250831" w:history="1">
+      <w:hyperlink w:anchor="_Toc242251489" w:history="1">
         <w:r>
           <w:rPr>
             <w:rStyle w:val="Hyperlink"/>
@@ -1344,7 +1344,7 @@
             <w:noProof/>
             <w:webHidden/>
           </w:rPr>
-          <w:instrText xml:space="preserve"> PAGEREF _Toc242250831 \h </w:instrText>
+          <w:instrText xml:space="preserve"> PAGEREF _Toc242251489 \h </w:instrText>
         </w:r>
         <w:r>
           <w:rPr>
@@ -1388,7 +1388,7 @@
           <w:szCs w:val="24"/>
         </w:rPr>
       </w:pPr>
-      <w:hyperlink w:anchor="_Toc242250832" w:history="1">
+      <w:hyperlink w:anchor="_Toc242251490" w:history="1">
         <w:r>
           <w:rPr>
             <w:rStyle w:val="Hyperlink"/>
@@ -1415,7 +1415,7 @@
             <w:noProof/>
             <w:webHidden/>
           </w:rPr>
-          <w:instrText xml:space="preserve"> PAGEREF _Toc242250832 \h </w:instrText>
+          <w:instrText xml:space="preserve"> PAGEREF _Toc242251490 \h </w:instrText>
         </w:r>
         <w:r>
           <w:rPr>
@@ -1459,7 +1459,7 @@
           <w:szCs w:val="24"/>
         </w:rPr>
       </w:pPr>
-      <w:hyperlink w:anchor="_Toc242250833" w:history="1">
+      <w:hyperlink w:anchor="_Toc242251491" w:history="1">
         <w:r>
           <w:rPr>
             <w:rStyle w:val="Hyperlink"/>
@@ -1486,7 +1486,7 @@
             <w:noProof/>
             <w:webHidden/>
           </w:rPr>
-          <w:instrText xml:space="preserve"> PAGEREF _Toc242250833 \h </w:instrText>
+          <w:instrText xml:space="preserve"> PAGEREF _Toc242251491 \h </w:instrText>
         </w:r>
         <w:r>
           <w:rPr>
@@ -1530,7 +1530,7 @@
           <w:szCs w:val="24"/>
         </w:rPr>
       </w:pPr>
-      <w:hyperlink w:anchor="_Toc242250834" w:history="1">
+      <w:hyperlink w:anchor="_Toc242251492" w:history="1">
         <w:r>
           <w:rPr>
             <w:rStyle w:val="Hyperlink"/>
@@ -1557,7 +1557,7 @@
             <w:noProof/>
             <w:webHidden/>
           </w:rPr>
-          <w:instrText xml:space="preserve"> PAGEREF _Toc242250834 \h </w:instrText>
+          <w:instrText xml:space="preserve"> PAGEREF _Toc242251492 \h </w:instrText>
         </w:r>
         <w:r>
           <w:rPr>
@@ -1601,7 +1601,7 @@
           <w:szCs w:val="24"/>
         </w:rPr>
       </w:pPr>
-      <w:hyperlink w:anchor="_Toc242250835" w:history="1">
+      <w:hyperlink w:anchor="_Toc242251493" w:history="1">
         <w:r>
           <w:rPr>
             <w:rStyle w:val="Hyperlink"/>
@@ -1628,7 +1628,7 @@
             <w:noProof/>
             <w:webHidden/>
           </w:rPr>
-          <w:instrText xml:space="preserve"> PAGEREF _Toc242250835 \h </w:instrText>
+          <w:instrText xml:space="preserve"> PAGEREF _Toc242251493 \h </w:instrText>
         </w:r>
         <w:r>
           <w:rPr>
@@ -1683,7 +1683,7 @@
       <w:pPr>
         <w:pStyle w:val="Heading11"/>
       </w:pPr>
-      <w:bookmarkStart w:id="0" w:name="_Toc242250820"/>
+      <w:bookmarkStart w:id="0" w:name="_Toc242251478"/>
       <w:r>
         <w:lastRenderedPageBreak/>
         <w:t>PHẦN 1. THÔNG TIN CHUNG</w:t>
@@ -1694,7 +1694,7 @@
       <w:pPr>
         <w:pStyle w:val="Heading21"/>
       </w:pPr>
-      <w:bookmarkStart w:id="1" w:name="_Toc242250821"/>
+      <w:bookmarkStart w:id="1" w:name="_Toc242251479"/>
       <w:r>
         <w:t>1.1. ĐỀ TÀI VÀ PHẠM VI</w:t>
       </w:r>
@@ -1751,7 +1751,7 @@
       <w:pPr>
         <w:pStyle w:val="Heading21"/>
       </w:pPr>
-      <w:bookmarkStart w:id="2" w:name="_Toc242250822"/>
+      <w:bookmarkStart w:id="2" w:name="_Toc242251480"/>
       <w:r>
         <w:t>1.2. CHIA VIỆC THEO PHÂN HỆ</w:t>
       </w:r>
@@ -2327,7 +2327,7 @@
       <w:pPr>
         <w:pStyle w:val="Heading21"/>
       </w:pPr>
-      <w:bookmarkStart w:id="3" w:name="_Toc242250823"/>
+      <w:bookmarkStart w:id="3" w:name="_Toc242251481"/>
       <w:r>
         <w:lastRenderedPageBreak/>
         <w:t>1.3. TÀI NGUYÊN DÙNG CHUNG</w:t>
@@ -2395,7 +2395,7 @@
       <w:pPr>
         <w:pStyle w:val="Heading11"/>
       </w:pPr>
-      <w:bookmarkStart w:id="4" w:name="_Toc242250824"/>
+      <w:bookmarkStart w:id="4" w:name="_Toc242251482"/>
       <w:r>
         <w:t>PHẦN 2. TÌNH HÌNH THỰC HIỆN</w:t>
       </w:r>
@@ -3116,7 +3116,7 @@
               <w:rPr>
                 <w:sz w:val="24"/>
               </w:rPr>
-              <w:t>Dự kiến 13/10/2026</w:t>
+              <w:t>Dự kiến 14/10/2026</w:t>
             </w:r>
           </w:p>
         </w:tc>
@@ -3255,7 +3255,7 @@
               <w:rPr>
                 <w:sz w:val="24"/>
               </w:rPr>
-              <w:t>Dự kiến 18/10/2026</w:t>
+              <w:t>Dự kiến 24/10/2026</w:t>
             </w:r>
           </w:p>
         </w:tc>
@@ -3287,7 +3287,7 @@
       <w:pPr>
         <w:pStyle w:val="Heading11"/>
       </w:pPr>
-      <w:bookmarkStart w:id="5" w:name="_Toc242250825"/>
+      <w:bookmarkStart w:id="5" w:name="_Toc242251483"/>
       <w:r>
         <w:t>PHẦN 3. KẾT QUẢ ĐÃ CÓ</w:t>
       </w:r>
@@ -3297,7 +3297,7 @@
       <w:pPr>
         <w:pStyle w:val="Heading21"/>
       </w:pPr>
-      <w:bookmarkStart w:id="6" w:name="_Toc242250826"/>
+      <w:bookmarkStart w:id="6" w:name="_Toc242251484"/>
       <w:r>
         <w:t>3.1. PHÂN TÍCH YÊU CẦU BÀI TẬP NHÓM</w:t>
       </w:r>
@@ -3737,7 +3737,7 @@
       <w:pPr>
         <w:pStyle w:val="Heading21"/>
       </w:pPr>
-      <w:bookmarkStart w:id="7" w:name="_Toc242250827"/>
+      <w:bookmarkStart w:id="7" w:name="_Toc242251485"/>
       <w:r>
         <w:t>3.2. CHUẨN BỊ KHẢO SÁT</w:t>
       </w:r>
@@ -3833,7 +3833,7 @@
       <w:pPr>
         <w:pStyle w:val="Heading21"/>
       </w:pPr>
-      <w:bookmarkStart w:id="8" w:name="_Toc242250828"/>
+      <w:bookmarkStart w:id="8" w:name="_Toc242251486"/>
       <w:r>
         <w:t>3.3. MÔ HÌNH HOÁ NGHIỆP VỤ (BẢN NHÁP)</w:t>
       </w:r>
@@ -4484,7 +4484,7 @@
         </w:rPr>
         <w:lastRenderedPageBreak/>
         <w:drawing>
-          <wp:inline distT="0" distB="0" distL="0" distR="0" wp14:anchorId="35D0958E" wp14:editId="1E063EAF">
+          <wp:inline distT="0" distB="0" distL="0" distR="0" wp14:anchorId="7A91877C" wp14:editId="3C07A01A">
             <wp:extent cx="3960000" cy="5096667"/>
             <wp:effectExtent l="0" t="0" r="0" b="0"/>
             <wp:docPr id="1204866784" name="Picture 1204866784"/>
@@ -5143,7 +5143,7 @@
       <w:pPr>
         <w:pStyle w:val="Heading21"/>
       </w:pPr>
-      <w:bookmarkStart w:id="9" w:name="_Toc242250829"/>
+      <w:bookmarkStart w:id="9" w:name="_Toc242251487"/>
       <w:r>
         <w:t>3.4. MÔ HÌNH HOÁ CHỨC NĂNG (BẢN NHÁP)</w:t>
       </w:r>
@@ -5170,7 +5170,7 @@
           <w:noProof/>
         </w:rPr>
         <w:drawing>
-          <wp:inline distT="0" distB="0" distL="0" distR="0" wp14:anchorId="709F7EBC" wp14:editId="31CDF739">
+          <wp:inline distT="0" distB="0" distL="0" distR="0" wp14:anchorId="0B95C942" wp14:editId="0C56AB37">
             <wp:extent cx="4320000" cy="1959721"/>
             <wp:effectExtent l="0" t="0" r="0" b="0"/>
             <wp:docPr id="1204866785" name="Picture 1204866785"/>
@@ -5231,7 +5231,7 @@
         </w:rPr>
         <w:lastRenderedPageBreak/>
         <w:drawing>
-          <wp:inline distT="0" distB="0" distL="0" distR="0" wp14:anchorId="4592022D" wp14:editId="0D6A423B">
+          <wp:inline distT="0" distB="0" distL="0" distR="0" wp14:anchorId="73F32655" wp14:editId="52128469">
             <wp:extent cx="3167455" cy="5039999"/>
             <wp:effectExtent l="0" t="0" r="0" b="0"/>
             <wp:docPr id="1204866786" name="Picture 1204866786"/>
@@ -5292,7 +5292,7 @@
         </w:rPr>
         <w:lastRenderedPageBreak/>
         <w:drawing>
-          <wp:inline distT="0" distB="0" distL="0" distR="0" wp14:anchorId="407B88A8" wp14:editId="5E3669D9">
+          <wp:inline distT="0" distB="0" distL="0" distR="0" wp14:anchorId="2B6EA1F6" wp14:editId="4E4830D5">
             <wp:extent cx="2641208" cy="5040000"/>
             <wp:effectExtent l="0" t="0" r="0" b="0"/>
             <wp:docPr id="1204866787" name="Picture 1204866787"/>
@@ -5822,7 +5822,7 @@
       <w:pPr>
         <w:pStyle w:val="Heading21"/>
       </w:pPr>
-      <w:bookmarkStart w:id="10" w:name="_Toc242250830"/>
+      <w:bookmarkStart w:id="10" w:name="_Toc242251488"/>
       <w:r>
         <w:t>3.5. MÔ HÌNH HOÁ CẤU TRÚC (KHUNG DÙNG CHUNG)</w:t>
       </w:r>
@@ -5867,7 +5867,7 @@
           <w:noProof/>
         </w:rPr>
         <w:drawing>
-          <wp:inline distT="0" distB="0" distL="0" distR="0" wp14:anchorId="68879B59" wp14:editId="355F864A">
+          <wp:inline distT="0" distB="0" distL="0" distR="0" wp14:anchorId="42864CBF" wp14:editId="353B0E69">
             <wp:extent cx="3240000" cy="3091629"/>
             <wp:effectExtent l="0" t="0" r="0" b="0"/>
             <wp:docPr id="1204866788" name="Picture 1204866788"/>
@@ -5928,7 +5928,7 @@
         </w:rPr>
         <w:lastRenderedPageBreak/>
         <w:drawing>
-          <wp:inline distT="0" distB="0" distL="0" distR="0" wp14:anchorId="2CAFA05F" wp14:editId="68A82E08">
+          <wp:inline distT="0" distB="0" distL="0" distR="0" wp14:anchorId="35A48F83" wp14:editId="0522655E">
             <wp:extent cx="4680000" cy="5630254"/>
             <wp:effectExtent l="0" t="0" r="0" b="0"/>
             <wp:docPr id="1204866789" name="Picture 1204866789"/>
@@ -5989,7 +5989,7 @@
         </w:rPr>
         <w:lastRenderedPageBreak/>
         <w:drawing>
-          <wp:inline distT="0" distB="0" distL="0" distR="0" wp14:anchorId="16FADABA" wp14:editId="30A5C1AD">
+          <wp:inline distT="0" distB="0" distL="0" distR="0" wp14:anchorId="13977349" wp14:editId="342E6A79">
             <wp:extent cx="3600000" cy="4712798"/>
             <wp:effectExtent l="0" t="0" r="0" b="0"/>
             <wp:docPr id="1204866790" name="Picture 1204866790"/>
@@ -6648,7 +6648,7 @@
       <w:pPr>
         <w:pStyle w:val="Heading21"/>
       </w:pPr>
-      <w:bookmarkStart w:id="11" w:name="_Toc242250831"/>
+      <w:bookmarkStart w:id="11" w:name="_Toc242251489"/>
       <w:r>
         <w:t>3.6. MẪU ĐẶC TẢ VÀ VÍ DỤ</w:t>
       </w:r>
@@ -6676,7 +6676,7 @@
         </w:rPr>
         <w:lastRenderedPageBreak/>
         <w:drawing>
-          <wp:inline distT="0" distB="0" distL="0" distR="0" wp14:anchorId="6203D4D9" wp14:editId="48098237">
+          <wp:inline distT="0" distB="0" distL="0" distR="0" wp14:anchorId="73B76B36" wp14:editId="5E98ECDA">
             <wp:extent cx="4845835" cy="6480000"/>
             <wp:effectExtent l="0" t="0" r="0" b="0"/>
             <wp:docPr id="1204866791" name="Picture 1204866791"/>
@@ -7032,7 +7032,7 @@
       <w:pPr>
         <w:pStyle w:val="Heading21"/>
       </w:pPr>
-      <w:bookmarkStart w:id="12" w:name="_Toc242250832"/>
+      <w:bookmarkStart w:id="12" w:name="_Toc242251490"/>
       <w:r>
         <w:t>3.7. BỘ GIAO DIỆN CHUNG</w:t>
       </w:r>
@@ -7068,7 +7068,7 @@
           <w:noProof/>
         </w:rPr>
         <w:drawing>
-          <wp:inline distT="0" distB="0" distL="0" distR="0" wp14:anchorId="2FD55BB6" wp14:editId="272C25E4">
+          <wp:inline distT="0" distB="0" distL="0" distR="0" wp14:anchorId="2BC35950" wp14:editId="00461E0B">
             <wp:extent cx="5400000" cy="3562500"/>
             <wp:effectExtent l="0" t="0" r="0" b="0"/>
             <wp:docPr id="1204866792" name="Picture 1204866792"/>
@@ -7129,7 +7129,7 @@
         </w:rPr>
         <w:lastRenderedPageBreak/>
         <w:drawing>
-          <wp:inline distT="0" distB="0" distL="0" distR="0" wp14:anchorId="63B66E53" wp14:editId="68B33F77">
+          <wp:inline distT="0" distB="0" distL="0" distR="0" wp14:anchorId="1CFB4684" wp14:editId="6ECD0A79">
             <wp:extent cx="5400000" cy="3375000"/>
             <wp:effectExtent l="0" t="0" r="0" b="0"/>
             <wp:docPr id="1204866793" name="Picture 1204866793"/>
@@ -7182,7 +7182,7 @@
       <w:pPr>
         <w:pStyle w:val="Heading11"/>
       </w:pPr>
-      <w:bookmarkStart w:id="13" w:name="_Toc242250833"/>
+      <w:bookmarkStart w:id="13" w:name="_Toc242251491"/>
       <w:r>
         <w:t>PHẦN 4. KẾ HOẠCH TIẾP THEO</w:t>
       </w:r>
@@ -7212,8 +7212,8 @@
       <w:tblGrid>
         <w:gridCol w:w="845"/>
         <w:gridCol w:w="1448"/>
-        <w:gridCol w:w="2532"/>
-        <w:gridCol w:w="3669"/>
+        <w:gridCol w:w="2533"/>
+        <w:gridCol w:w="3668"/>
       </w:tblGrid>
       <w:tr>
         <w:trPr>
@@ -7341,7 +7341,7 @@
               <w:rPr>
                 <w:sz w:val="24"/>
               </w:rPr>
-              <w:t>Chốt cửa hàng, phỏng vấn, phát bảng hỏi</w:t>
+              <w:t>Chốt gói việc, chốt cửa hàng, hẹn phỏng vấn, tạo Google Form</w:t>
             </w:r>
           </w:p>
         </w:tc>
@@ -7357,7 +7357,7 @@
               <w:rPr>
                 <w:sz w:val="24"/>
               </w:rPr>
-              <w:t>Biên bản phỏng vấn, ảnh biểu mẫu, hiện trạng và yêu cầu từng gói</w:t>
+              <w:t>Gói việc có người nhận, lịch phỏng vấn, link bảng hỏi</w:t>
             </w:r>
           </w:p>
         </w:tc>
@@ -7410,7 +7410,7 @@
               <w:rPr>
                 <w:sz w:val="24"/>
               </w:rPr>
-              <w:t>Mô hình hoá nghiệp vụ</w:t>
+              <w:t>Phỏng vấn cửa hàng, phát bảng hỏi</w:t>
             </w:r>
           </w:p>
         </w:tc>
@@ -7426,7 +7426,7 @@
               <w:rPr>
                 <w:sz w:val="24"/>
               </w:rPr>
-              <w:t>Đặc tả và sơ đồ hoạt động 6 quy trình; chỉnh use case nghiệp vụ tổng</w:t>
+              <w:t>Biên bản phỏng vấn, ảnh biểu mẫu, hiện trạng và yêu cầu từng gói</w:t>
             </w:r>
           </w:p>
         </w:tc>
@@ -7479,7 +7479,7 @@
               <w:rPr>
                 <w:sz w:val="24"/>
               </w:rPr>
-              <w:t>Mô hình hoá chức năng</w:t>
+              <w:t>Mô hình hoá nghiệp vụ</w:t>
             </w:r>
           </w:p>
         </w:tc>
@@ -7495,20 +7495,7 @@
               <w:rPr>
                 <w:sz w:val="24"/>
               </w:rPr>
-              <w:t xml:space="preserve">Use case phân hệ, đặc tả 3 use case mỗi gói; </w:t>
-            </w:r>
-            <w:r>
-              <w:rPr>
-                <w:b/>
-                <w:sz w:val="24"/>
-              </w:rPr>
-              <w:t>Mốc 1</w:t>
-            </w:r>
-            <w:r>
-              <w:rPr>
-                <w:sz w:val="24"/>
-              </w:rPr>
-              <w:t xml:space="preserve"> nội bộ</w:t>
+              <w:t>Đặc tả và sơ đồ hoạt động các quy trình; chỉnh use case nghiệp vụ tổng</w:t>
             </w:r>
           </w:p>
         </w:tc>
@@ -7561,7 +7548,7 @@
               <w:rPr>
                 <w:sz w:val="24"/>
               </w:rPr>
-              <w:t>Mô hình hoá cấu trúc</w:t>
+              <w:t>Mô hình hoá chức năng</w:t>
             </w:r>
           </w:p>
         </w:tc>
@@ -7577,7 +7564,20 @@
               <w:rPr>
                 <w:sz w:val="24"/>
               </w:rPr>
-              <w:t>Chốt từ điển lớp; sơ đồ lớp phân tích mỗi gói</w:t>
+              <w:t xml:space="preserve">Use case phân hệ, đặc tả 3 use case mỗi gói; </w:t>
+            </w:r>
+            <w:r>
+              <w:rPr>
+                <w:b/>
+                <w:sz w:val="24"/>
+              </w:rPr>
+              <w:t>Mốc 1</w:t>
+            </w:r>
+            <w:r>
+              <w:rPr>
+                <w:sz w:val="24"/>
+              </w:rPr>
+              <w:t xml:space="preserve"> nội bộ</w:t>
             </w:r>
           </w:p>
         </w:tc>
@@ -7598,7 +7598,7 @@
               <w:rPr>
                 <w:sz w:val="24"/>
               </w:rPr>
-              <w:t>12–13</w:t>
+              <w:t>12</w:t>
             </w:r>
           </w:p>
         </w:tc>
@@ -7614,7 +7614,7 @@
               <w:rPr>
                 <w:sz w:val="24"/>
               </w:rPr>
-              <w:t>02–15/11</w:t>
+              <w:t>02–08/11</w:t>
             </w:r>
           </w:p>
         </w:tc>
@@ -7630,7 +7630,7 @@
               <w:rPr>
                 <w:sz w:val="24"/>
               </w:rPr>
-              <w:t>Thiết kế lớp, CSDL, giao diện</w:t>
+              <w:t>Mô hình hoá cấu trúc</w:t>
             </w:r>
           </w:p>
         </w:tc>
@@ -7646,14 +7646,7 @@
               <w:rPr>
                 <w:sz w:val="24"/>
               </w:rPr>
-              <w:t xml:space="preserve">Sơ đồ lớp tổng hợp, lược đồ CSDL, màn hình mỗi gói; </w:t>
-            </w:r>
-            <w:r>
-              <w:rPr>
-                <w:b/>
-                <w:sz w:val="24"/>
-              </w:rPr>
-              <w:t>Mốc 2</w:t>
+              <w:t>Chốt từ điển lớp; sơ đồ lớp phân tích mỗi gói</w:t>
             </w:r>
           </w:p>
         </w:tc>
@@ -7674,7 +7667,7 @@
               <w:rPr>
                 <w:sz w:val="24"/>
               </w:rPr>
-              <w:t>14</w:t>
+              <w:t>13</w:t>
             </w:r>
           </w:p>
         </w:tc>
@@ -7690,7 +7683,7 @@
               <w:rPr>
                 <w:sz w:val="24"/>
               </w:rPr>
-              <w:t>16–22/11</w:t>
+              <w:t>09–15/11</w:t>
             </w:r>
           </w:p>
         </w:tc>
@@ -7706,7 +7699,7 @@
               <w:rPr>
                 <w:sz w:val="24"/>
               </w:rPr>
-              <w:t>Thiết kế chức năng</w:t>
+              <w:t>Thiết kế lớp và CSDL</w:t>
             </w:r>
           </w:p>
         </w:tc>
@@ -7722,7 +7715,14 @@
               <w:rPr>
                 <w:sz w:val="24"/>
               </w:rPr>
-              <w:t>Kiến trúc 3 tầng, sơ đồ tuần tự 2 use case mỗi gói</w:t>
+              <w:t xml:space="preserve">Sơ đồ lớp tổng hợp, lược đồ CSDL, từ điển dữ liệu; </w:t>
+            </w:r>
+            <w:r>
+              <w:rPr>
+                <w:b/>
+                <w:sz w:val="24"/>
+              </w:rPr>
+              <w:t>Mốc 2</w:t>
             </w:r>
           </w:p>
         </w:tc>
@@ -7743,7 +7743,7 @@
               <w:rPr>
                 <w:sz w:val="24"/>
               </w:rPr>
-              <w:t>15</w:t>
+              <w:t>14</w:t>
             </w:r>
           </w:p>
         </w:tc>
@@ -7759,7 +7759,7 @@
               <w:rPr>
                 <w:sz w:val="24"/>
               </w:rPr>
-              <w:t>23–29/11</w:t>
+              <w:t>16–22/11</w:t>
             </w:r>
           </w:p>
         </w:tc>
@@ -7775,7 +7775,7 @@
               <w:rPr>
                 <w:sz w:val="24"/>
               </w:rPr>
-              <w:t>Ghép và soát báo cáo</w:t>
+              <w:t>Thiết kế chức năng và giao diện</w:t>
             </w:r>
           </w:p>
         </w:tc>
@@ -7791,14 +7791,7 @@
               <w:rPr>
                 <w:sz w:val="24"/>
               </w:rPr>
-              <w:t xml:space="preserve">Báo cáo hoàn chỉnh, đánh giá khả thi; </w:t>
-            </w:r>
-            <w:r>
-              <w:rPr>
-                <w:b/>
-                <w:sz w:val="24"/>
-              </w:rPr>
-              <w:t>Mốc 3</w:t>
+              <w:t>Kiến trúc 3 tầng, sơ đồ tuần tự 2 use case mỗi gói, màn hình mỗi gói</w:t>
             </w:r>
           </w:p>
         </w:tc>
@@ -7819,6 +7812,82 @@
               <w:rPr>
                 <w:sz w:val="24"/>
               </w:rPr>
+              <w:t>15</w:t>
+            </w:r>
+          </w:p>
+        </w:tc>
+        <w:tc>
+          <w:tcPr>
+            <w:tcW w:w="1474" w:type="dxa"/>
+          </w:tcPr>
+          <w:p>
+            <w:pPr>
+              <w:spacing w:before="20" w:after="20" w:line="276" w:lineRule="auto"/>
+            </w:pPr>
+            <w:r>
+              <w:rPr>
+                <w:sz w:val="24"/>
+              </w:rPr>
+              <w:t>23–29/11</w:t>
+            </w:r>
+          </w:p>
+        </w:tc>
+        <w:tc>
+          <w:tcPr>
+            <w:tcW w:w="2608" w:type="dxa"/>
+          </w:tcPr>
+          <w:p>
+            <w:pPr>
+              <w:spacing w:before="20" w:after="20" w:line="276" w:lineRule="auto"/>
+            </w:pPr>
+            <w:r>
+              <w:rPr>
+                <w:sz w:val="24"/>
+              </w:rPr>
+              <w:t>Ghép và soát báo cáo</w:t>
+            </w:r>
+          </w:p>
+        </w:tc>
+        <w:tc>
+          <w:tcPr>
+            <w:tcW w:w="3798" w:type="dxa"/>
+          </w:tcPr>
+          <w:p>
+            <w:pPr>
+              <w:spacing w:before="20" w:after="20" w:line="276" w:lineRule="auto"/>
+            </w:pPr>
+            <w:r>
+              <w:rPr>
+                <w:sz w:val="24"/>
+              </w:rPr>
+              <w:t xml:space="preserve">Báo cáo hoàn chỉnh, đánh giá khả thi; </w:t>
+            </w:r>
+            <w:r>
+              <w:rPr>
+                <w:b/>
+                <w:sz w:val="24"/>
+              </w:rPr>
+              <w:t>Mốc 3</w:t>
+            </w:r>
+          </w:p>
+        </w:tc>
+      </w:tr>
+      <w:tr>
+        <w:trPr>
+          <w:jc w:val="center"/>
+        </w:trPr>
+        <w:tc>
+          <w:tcPr>
+            <w:tcW w:w="850" w:type="dxa"/>
+          </w:tcPr>
+          <w:p>
+            <w:pPr>
+              <w:spacing w:before="20" w:after="20" w:line="276" w:lineRule="auto"/>
+            </w:pPr>
+            <w:r>
+              <w:rPr>
+                <w:sz w:val="24"/>
+              </w:rPr>
               <w:t>16</w:t>
             </w:r>
           </w:p>
@@ -7883,9 +7952,8 @@
       <w:pPr>
         <w:pStyle w:val="Heading11"/>
       </w:pPr>
-      <w:bookmarkStart w:id="14" w:name="_Toc242250834"/>
-      <w:r>
-        <w:lastRenderedPageBreak/>
+      <w:bookmarkStart w:id="14" w:name="_Toc242251492"/>
+      <w:r>
         <w:t>PHẦN 5. KHÓ KHĂN VÀ ĐỀ XUẤT</w:t>
       </w:r>
       <w:bookmarkEnd w:id="14"/>
@@ -8011,7 +8079,7 @@
       <w:pPr>
         <w:pStyle w:val="Heading11"/>
       </w:pPr>
-      <w:bookmarkStart w:id="15" w:name="_Toc242250835"/>
+      <w:bookmarkStart w:id="15" w:name="_Toc242251493"/>
       <w:r>
         <w:t>TÀI LIỆU THAM KHẢO</w:t>
       </w:r>
@@ -9334,7 +9402,7 @@
     <w:autoRedefine/>
     <w:uiPriority w:val="39"/>
     <w:unhideWhenUsed/>
-    <w:rsid w:val="003964AA"/>
+    <w:rsid w:val="00766609"/>
     <w:pPr>
       <w:spacing w:after="100"/>
     </w:pPr>
@@ -9346,7 +9414,7 @@
     <w:autoRedefine/>
     <w:uiPriority w:val="39"/>
     <w:unhideWhenUsed/>
-    <w:rsid w:val="003964AA"/>
+    <w:rsid w:val="00766609"/>
     <w:pPr>
       <w:spacing w:after="100"/>
       <w:ind w:left="260"/>

</xml_diff>

<commit_message>
Cap nhat bao cao tien do: ten 5 thanh vien, lop va GVHD, bam sat bai giang chuong 1-3
</commit_message>
<xml_diff>
--- a/bao-cao/BaoCao_TienDo_Nhom4_PTTKHTTT.docx
+++ b/bao-cao/BaoCao_TienDo_Nhom4_PTTKHTTT.docx
@@ -285,6 +285,13 @@
           <w:szCs w:val="32"/>
         </w:rPr>
       </w:pPr>
+      <w:r>
+        <w:rPr>
+          <w:sz w:val="32"/>
+          <w:szCs w:val="32"/>
+        </w:rPr>
+        <w:t>Lớp: 15DHTH06 · Mã lớp học phần: 010100361506</w:t>
+      </w:r>
     </w:p>
     <w:p>
       <w:pPr>
@@ -333,7 +340,7 @@
           <w:sz w:val="28"/>
           <w:szCs w:val="28"/>
         </w:rPr>
-        <w:t>………………………………………</w:t>
+        <w:t>Nguyễn Thị Thúy A</w:t>
       </w:r>
     </w:p>
     <w:p>
@@ -536,7 +543,7 @@
       <w:r>
         <w:fldChar w:fldCharType="separate"/>
       </w:r>
-      <w:hyperlink w:anchor="_Toc242251478" w:history="1">
+      <w:hyperlink w:anchor="_Toc242361258" w:history="1">
         <w:r>
           <w:rPr>
             <w:rStyle w:val="Hyperlink"/>
@@ -563,7 +570,7 @@
             <w:noProof/>
             <w:webHidden/>
           </w:rPr>
-          <w:instrText xml:space="preserve"> PAGEREF _Toc242251478 \h </w:instrText>
+          <w:instrText xml:space="preserve"> PAGEREF _Toc242361258 \h </w:instrText>
         </w:r>
         <w:r>
           <w:rPr>
@@ -607,7 +614,7 @@
           <w:szCs w:val="24"/>
         </w:rPr>
       </w:pPr>
-      <w:hyperlink w:anchor="_Toc242251479" w:history="1">
+      <w:hyperlink w:anchor="_Toc242361259" w:history="1">
         <w:r>
           <w:rPr>
             <w:rStyle w:val="Hyperlink"/>
@@ -634,7 +641,7 @@
             <w:noProof/>
             <w:webHidden/>
           </w:rPr>
-          <w:instrText xml:space="preserve"> PAGEREF _Toc242251479 \h </w:instrText>
+          <w:instrText xml:space="preserve"> PAGEREF _Toc242361259 \h </w:instrText>
         </w:r>
         <w:r>
           <w:rPr>
@@ -678,7 +685,7 @@
           <w:szCs w:val="24"/>
         </w:rPr>
       </w:pPr>
-      <w:hyperlink w:anchor="_Toc242251480" w:history="1">
+      <w:hyperlink w:anchor="_Toc242361260" w:history="1">
         <w:r>
           <w:rPr>
             <w:rStyle w:val="Hyperlink"/>
@@ -705,7 +712,7 @@
             <w:noProof/>
             <w:webHidden/>
           </w:rPr>
-          <w:instrText xml:space="preserve"> PAGEREF _Toc242251480 \h </w:instrText>
+          <w:instrText xml:space="preserve"> PAGEREF _Toc242361260 \h </w:instrText>
         </w:r>
         <w:r>
           <w:rPr>
@@ -749,7 +756,7 @@
           <w:szCs w:val="24"/>
         </w:rPr>
       </w:pPr>
-      <w:hyperlink w:anchor="_Toc242251481" w:history="1">
+      <w:hyperlink w:anchor="_Toc242361261" w:history="1">
         <w:r>
           <w:rPr>
             <w:rStyle w:val="Hyperlink"/>
@@ -776,7 +783,7 @@
             <w:noProof/>
             <w:webHidden/>
           </w:rPr>
-          <w:instrText xml:space="preserve"> PAGEREF _Toc242251481 \h </w:instrText>
+          <w:instrText xml:space="preserve"> PAGEREF _Toc242361261 \h </w:instrText>
         </w:r>
         <w:r>
           <w:rPr>
@@ -820,7 +827,7 @@
           <w:szCs w:val="24"/>
         </w:rPr>
       </w:pPr>
-      <w:hyperlink w:anchor="_Toc242251482" w:history="1">
+      <w:hyperlink w:anchor="_Toc242361262" w:history="1">
         <w:r>
           <w:rPr>
             <w:rStyle w:val="Hyperlink"/>
@@ -847,7 +854,7 @@
             <w:noProof/>
             <w:webHidden/>
           </w:rPr>
-          <w:instrText xml:space="preserve"> PAGEREF _Toc242251482 \h </w:instrText>
+          <w:instrText xml:space="preserve"> PAGEREF _Toc242361262 \h </w:instrText>
         </w:r>
         <w:r>
           <w:rPr>
@@ -891,7 +898,7 @@
           <w:szCs w:val="24"/>
         </w:rPr>
       </w:pPr>
-      <w:hyperlink w:anchor="_Toc242251483" w:history="1">
+      <w:hyperlink w:anchor="_Toc242361263" w:history="1">
         <w:r>
           <w:rPr>
             <w:rStyle w:val="Hyperlink"/>
@@ -918,7 +925,7 @@
             <w:noProof/>
             <w:webHidden/>
           </w:rPr>
-          <w:instrText xml:space="preserve"> PAGEREF _Toc242251483 \h </w:instrText>
+          <w:instrText xml:space="preserve"> PAGEREF _Toc242361263 \h </w:instrText>
         </w:r>
         <w:r>
           <w:rPr>
@@ -962,7 +969,7 @@
           <w:szCs w:val="24"/>
         </w:rPr>
       </w:pPr>
-      <w:hyperlink w:anchor="_Toc242251484" w:history="1">
+      <w:hyperlink w:anchor="_Toc242361264" w:history="1">
         <w:r>
           <w:rPr>
             <w:rStyle w:val="Hyperlink"/>
@@ -989,7 +996,7 @@
             <w:noProof/>
             <w:webHidden/>
           </w:rPr>
-          <w:instrText xml:space="preserve"> PAGEREF _Toc242251484 \h </w:instrText>
+          <w:instrText xml:space="preserve"> PAGEREF _Toc242361264 \h </w:instrText>
         </w:r>
         <w:r>
           <w:rPr>
@@ -1033,7 +1040,7 @@
           <w:szCs w:val="24"/>
         </w:rPr>
       </w:pPr>
-      <w:hyperlink w:anchor="_Toc242251485" w:history="1">
+      <w:hyperlink w:anchor="_Toc242361265" w:history="1">
         <w:r>
           <w:rPr>
             <w:rStyle w:val="Hyperlink"/>
@@ -1060,7 +1067,7 @@
             <w:noProof/>
             <w:webHidden/>
           </w:rPr>
-          <w:instrText xml:space="preserve"> PAGEREF _Toc242251485 \h </w:instrText>
+          <w:instrText xml:space="preserve"> PAGEREF _Toc242361265 \h </w:instrText>
         </w:r>
         <w:r>
           <w:rPr>
@@ -1080,7 +1087,7 @@
             <w:noProof/>
             <w:webHidden/>
           </w:rPr>
-          <w:t>3</w:t>
+          <w:t>4</w:t>
         </w:r>
         <w:r>
           <w:rPr>
@@ -1104,7 +1111,7 @@
           <w:szCs w:val="24"/>
         </w:rPr>
       </w:pPr>
-      <w:hyperlink w:anchor="_Toc242251486" w:history="1">
+      <w:hyperlink w:anchor="_Toc242361266" w:history="1">
         <w:r>
           <w:rPr>
             <w:rStyle w:val="Hyperlink"/>
@@ -1131,7 +1138,7 @@
             <w:noProof/>
             <w:webHidden/>
           </w:rPr>
-          <w:instrText xml:space="preserve"> PAGEREF _Toc242251486 \h </w:instrText>
+          <w:instrText xml:space="preserve"> PAGEREF _Toc242361266 \h </w:instrText>
         </w:r>
         <w:r>
           <w:rPr>
@@ -1175,7 +1182,7 @@
           <w:szCs w:val="24"/>
         </w:rPr>
       </w:pPr>
-      <w:hyperlink w:anchor="_Toc242251487" w:history="1">
+      <w:hyperlink w:anchor="_Toc242361267" w:history="1">
         <w:r>
           <w:rPr>
             <w:rStyle w:val="Hyperlink"/>
@@ -1202,7 +1209,7 @@
             <w:noProof/>
             <w:webHidden/>
           </w:rPr>
-          <w:instrText xml:space="preserve"> PAGEREF _Toc242251487 \h </w:instrText>
+          <w:instrText xml:space="preserve"> PAGEREF _Toc242361267 \h </w:instrText>
         </w:r>
         <w:r>
           <w:rPr>
@@ -1222,7 +1229,7 @@
             <w:noProof/>
             <w:webHidden/>
           </w:rPr>
-          <w:t>6</w:t>
+          <w:t>7</w:t>
         </w:r>
         <w:r>
           <w:rPr>
@@ -1246,7 +1253,7 @@
           <w:szCs w:val="24"/>
         </w:rPr>
       </w:pPr>
-      <w:hyperlink w:anchor="_Toc242251488" w:history="1">
+      <w:hyperlink w:anchor="_Toc242361268" w:history="1">
         <w:r>
           <w:rPr>
             <w:rStyle w:val="Hyperlink"/>
@@ -1273,7 +1280,7 @@
             <w:noProof/>
             <w:webHidden/>
           </w:rPr>
-          <w:instrText xml:space="preserve"> PAGEREF _Toc242251488 \h </w:instrText>
+          <w:instrText xml:space="preserve"> PAGEREF _Toc242361268 \h </w:instrText>
         </w:r>
         <w:r>
           <w:rPr>
@@ -1293,7 +1300,7 @@
             <w:noProof/>
             <w:webHidden/>
           </w:rPr>
-          <w:t>9</w:t>
+          <w:t>10</w:t>
         </w:r>
         <w:r>
           <w:rPr>
@@ -1317,7 +1324,7 @@
           <w:szCs w:val="24"/>
         </w:rPr>
       </w:pPr>
-      <w:hyperlink w:anchor="_Toc242251489" w:history="1">
+      <w:hyperlink w:anchor="_Toc242361269" w:history="1">
         <w:r>
           <w:rPr>
             <w:rStyle w:val="Hyperlink"/>
@@ -1344,7 +1351,7 @@
             <w:noProof/>
             <w:webHidden/>
           </w:rPr>
-          <w:instrText xml:space="preserve"> PAGEREF _Toc242251489 \h </w:instrText>
+          <w:instrText xml:space="preserve"> PAGEREF _Toc242361269 \h </w:instrText>
         </w:r>
         <w:r>
           <w:rPr>
@@ -1364,7 +1371,7 @@
             <w:noProof/>
             <w:webHidden/>
           </w:rPr>
-          <w:t>12</w:t>
+          <w:t>13</w:t>
         </w:r>
         <w:r>
           <w:rPr>
@@ -1388,7 +1395,7 @@
           <w:szCs w:val="24"/>
         </w:rPr>
       </w:pPr>
-      <w:hyperlink w:anchor="_Toc242251490" w:history="1">
+      <w:hyperlink w:anchor="_Toc242361270" w:history="1">
         <w:r>
           <w:rPr>
             <w:rStyle w:val="Hyperlink"/>
@@ -1415,7 +1422,7 @@
             <w:noProof/>
             <w:webHidden/>
           </w:rPr>
-          <w:instrText xml:space="preserve"> PAGEREF _Toc242251490 \h </w:instrText>
+          <w:instrText xml:space="preserve"> PAGEREF _Toc242361270 \h </w:instrText>
         </w:r>
         <w:r>
           <w:rPr>
@@ -1435,7 +1442,7 @@
             <w:noProof/>
             <w:webHidden/>
           </w:rPr>
-          <w:t>14</w:t>
+          <w:t>16</w:t>
         </w:r>
         <w:r>
           <w:rPr>
@@ -1459,7 +1466,7 @@
           <w:szCs w:val="24"/>
         </w:rPr>
       </w:pPr>
-      <w:hyperlink w:anchor="_Toc242251491" w:history="1">
+      <w:hyperlink w:anchor="_Toc242361271" w:history="1">
         <w:r>
           <w:rPr>
             <w:rStyle w:val="Hyperlink"/>
@@ -1486,7 +1493,7 @@
             <w:noProof/>
             <w:webHidden/>
           </w:rPr>
-          <w:instrText xml:space="preserve"> PAGEREF _Toc242251491 \h </w:instrText>
+          <w:instrText xml:space="preserve"> PAGEREF _Toc242361271 \h </w:instrText>
         </w:r>
         <w:r>
           <w:rPr>
@@ -1506,7 +1513,7 @@
             <w:noProof/>
             <w:webHidden/>
           </w:rPr>
-          <w:t>15</w:t>
+          <w:t>17</w:t>
         </w:r>
         <w:r>
           <w:rPr>
@@ -1530,7 +1537,7 @@
           <w:szCs w:val="24"/>
         </w:rPr>
       </w:pPr>
-      <w:hyperlink w:anchor="_Toc242251492" w:history="1">
+      <w:hyperlink w:anchor="_Toc242361272" w:history="1">
         <w:r>
           <w:rPr>
             <w:rStyle w:val="Hyperlink"/>
@@ -1557,7 +1564,7 @@
             <w:noProof/>
             <w:webHidden/>
           </w:rPr>
-          <w:instrText xml:space="preserve"> PAGEREF _Toc242251492 \h </w:instrText>
+          <w:instrText xml:space="preserve"> PAGEREF _Toc242361272 \h </w:instrText>
         </w:r>
         <w:r>
           <w:rPr>
@@ -1577,7 +1584,7 @@
             <w:noProof/>
             <w:webHidden/>
           </w:rPr>
-          <w:t>16</w:t>
+          <w:t>18</w:t>
         </w:r>
         <w:r>
           <w:rPr>
@@ -1601,7 +1608,7 @@
           <w:szCs w:val="24"/>
         </w:rPr>
       </w:pPr>
-      <w:hyperlink w:anchor="_Toc242251493" w:history="1">
+      <w:hyperlink w:anchor="_Toc242361273" w:history="1">
         <w:r>
           <w:rPr>
             <w:rStyle w:val="Hyperlink"/>
@@ -1628,7 +1635,7 @@
             <w:noProof/>
             <w:webHidden/>
           </w:rPr>
-          <w:instrText xml:space="preserve"> PAGEREF _Toc242251493 \h </w:instrText>
+          <w:instrText xml:space="preserve"> PAGEREF _Toc242361273 \h </w:instrText>
         </w:r>
         <w:r>
           <w:rPr>
@@ -1648,7 +1655,7 @@
             <w:noProof/>
             <w:webHidden/>
           </w:rPr>
-          <w:t>16</w:t>
+          <w:t>18</w:t>
         </w:r>
         <w:r>
           <w:rPr>
@@ -1683,7 +1690,7 @@
       <w:pPr>
         <w:pStyle w:val="Heading11"/>
       </w:pPr>
-      <w:bookmarkStart w:id="0" w:name="_Toc242251478"/>
+      <w:bookmarkStart w:id="0" w:name="_Toc242361258"/>
       <w:r>
         <w:lastRenderedPageBreak/>
         <w:t>PHẦN 1. THÔNG TIN CHUNG</w:t>
@@ -1694,7 +1701,7 @@
       <w:pPr>
         <w:pStyle w:val="Heading21"/>
       </w:pPr>
-      <w:bookmarkStart w:id="1" w:name="_Toc242251479"/>
+      <w:bookmarkStart w:id="1" w:name="_Toc242361259"/>
       <w:r>
         <w:t>1.1. ĐỀ TÀI VÀ PHẠM VI</w:t>
       </w:r>
@@ -1751,7 +1758,7 @@
       <w:pPr>
         <w:pStyle w:val="Heading21"/>
       </w:pPr>
-      <w:bookmarkStart w:id="2" w:name="_Toc242251480"/>
+      <w:bookmarkStart w:id="2" w:name="_Toc242361260"/>
       <w:r>
         <w:t>1.2. CHIA VIỆC THEO PHÂN HỆ</w:t>
       </w:r>
@@ -1789,11 +1796,11 @@
         <w:tblLook w:val="04A0" w:firstRow="1" w:lastRow="0" w:firstColumn="1" w:lastColumn="0" w:noHBand="0" w:noVBand="1"/>
       </w:tblPr>
       <w:tblGrid>
-        <w:gridCol w:w="672"/>
-        <w:gridCol w:w="2299"/>
-        <w:gridCol w:w="2136"/>
-        <w:gridCol w:w="2452"/>
-        <w:gridCol w:w="935"/>
+        <w:gridCol w:w="680"/>
+        <w:gridCol w:w="2435"/>
+        <w:gridCol w:w="1812"/>
+        <w:gridCol w:w="2604"/>
+        <w:gridCol w:w="963"/>
       </w:tblGrid>
       <w:tr>
         <w:trPr>
@@ -2024,7 +2031,7 @@
               <w:rPr>
                 <w:sz w:val="24"/>
               </w:rPr>
-              <w:t>……………………</w:t>
+              <w:t>Lê Đạt Tuấn Kiệt</w:t>
             </w:r>
           </w:p>
         </w:tc>
@@ -2109,7 +2116,7 @@
               <w:rPr>
                 <w:sz w:val="24"/>
               </w:rPr>
-              <w:t>……………………</w:t>
+              <w:t>Huỳnh Văn Lân</w:t>
             </w:r>
           </w:p>
         </w:tc>
@@ -2194,7 +2201,7 @@
               <w:rPr>
                 <w:sz w:val="24"/>
               </w:rPr>
-              <w:t>……………………</w:t>
+              <w:t>Võ Trí Thức</w:t>
             </w:r>
           </w:p>
         </w:tc>
@@ -2279,7 +2286,7 @@
               <w:rPr>
                 <w:sz w:val="24"/>
               </w:rPr>
-              <w:t>……………………</w:t>
+              <w:t>Nguyễn Đăng Khoa</w:t>
             </w:r>
           </w:p>
         </w:tc>
@@ -2327,7 +2334,7 @@
       <w:pPr>
         <w:pStyle w:val="Heading21"/>
       </w:pPr>
-      <w:bookmarkStart w:id="3" w:name="_Toc242251481"/>
+      <w:bookmarkStart w:id="3" w:name="_Toc242361261"/>
       <w:r>
         <w:lastRenderedPageBreak/>
         <w:t>1.3. TÀI NGUYÊN DÙNG CHUNG</w:t>
@@ -2395,7 +2402,7 @@
       <w:pPr>
         <w:pStyle w:val="Heading11"/>
       </w:pPr>
-      <w:bookmarkStart w:id="4" w:name="_Toc242251482"/>
+      <w:bookmarkStart w:id="4" w:name="_Toc242361262"/>
       <w:r>
         <w:t>PHẦN 2. TÌNH HÌNH THỰC HIỆN</w:t>
       </w:r>
@@ -2433,10 +2440,10 @@
         <w:tblLook w:val="04A0" w:firstRow="1" w:lastRow="0" w:firstColumn="1" w:lastColumn="0" w:noHBand="0" w:noVBand="1"/>
       </w:tblPr>
       <w:tblGrid>
-        <w:gridCol w:w="4034"/>
+        <w:gridCol w:w="4036"/>
         <w:gridCol w:w="1767"/>
-        <w:gridCol w:w="1574"/>
-        <w:gridCol w:w="1119"/>
+        <w:gridCol w:w="1573"/>
+        <w:gridCol w:w="1118"/>
       </w:tblGrid>
       <w:tr>
         <w:trPr>
@@ -2739,7 +2746,7 @@
               <w:rPr>
                 <w:sz w:val="24"/>
               </w:rPr>
-              <w:t>Quy ước vẽ sơ đồ, mẫu đặc tả quy trình và use case</w:t>
+              <w:t>Đối chiếu bài giảng chương 1, 1.2, 2, 3; vẽ lại sơ đồ nghiệp vụ theo ký hiệu bài giảng</w:t>
             </w:r>
           </w:p>
         </w:tc>
@@ -2808,7 +2815,7 @@
               <w:rPr>
                 <w:sz w:val="24"/>
               </w:rPr>
-              <w:t>Tác nhân, thực thể, use case nghiệp vụ tổng (bản nháp)</w:t>
+              <w:t>Kế hoạch phỏng vấn tổng quan, bảng hướng dẫn buổi phỏng vấn, mẫu biên bản (theo chương 2)</w:t>
             </w:r>
           </w:p>
         </w:tc>
@@ -2856,7 +2863,7 @@
               <w:rPr>
                 <w:sz w:val="24"/>
               </w:rPr>
-              <w:t>50%</w:t>
+              <w:t>100%</w:t>
             </w:r>
           </w:p>
         </w:tc>
@@ -2877,7 +2884,7 @@
               <w:rPr>
                 <w:sz w:val="24"/>
               </w:rPr>
-              <w:t>Tác nhân hệ thống, use case tổng quát, danh mục 35 use case (bản nháp)</w:t>
+              <w:t>Quy ước vẽ sơ đồ, mẫu đặc tả use case nghiệp vụ và use case hệ thống</w:t>
             </w:r>
           </w:p>
         </w:tc>
@@ -2925,7 +2932,7 @@
               <w:rPr>
                 <w:sz w:val="24"/>
               </w:rPr>
-              <w:t>50%</w:t>
+              <w:t>75%</w:t>
             </w:r>
           </w:p>
         </w:tc>
@@ -2946,7 +2953,7 @@
               <w:rPr>
                 <w:sz w:val="24"/>
               </w:rPr>
-              <w:t>Lớp dùng chung, trạng thái đơn hàng và chiếc máy (bản nháp)</w:t>
+              <w:t>Hiện trạng tổ chức, thuật ngữ, tác nhân, thừa tác viên, thực thể, use case nghiệp vụ tổng (bản nháp)</w:t>
             </w:r>
           </w:p>
         </w:tc>
@@ -3015,7 +3022,7 @@
               <w:rPr>
                 <w:sz w:val="24"/>
               </w:rPr>
-              <w:t>Chọn cửa hàng khảo sát, hẹn lịch phỏng vấn</w:t>
+              <w:t>Tác nhân hệ thống, use case tổng quát, danh mục 35 use case (bản nháp)</w:t>
             </w:r>
           </w:p>
         </w:tc>
@@ -3031,7 +3038,7 @@
               <w:rPr>
                 <w:sz w:val="24"/>
               </w:rPr>
-              <w:t>Cả nhóm</w:t>
+              <w:t>Phạm Tuấn Kiệt</w:t>
             </w:r>
           </w:p>
         </w:tc>
@@ -3047,7 +3054,7 @@
               <w:rPr>
                 <w:sz w:val="24"/>
               </w:rPr>
-              <w:t>Dự kiến 11/10/2026</w:t>
+              <w:t>07/10/2026</w:t>
             </w:r>
           </w:p>
         </w:tc>
@@ -3063,7 +3070,7 @@
               <w:rPr>
                 <w:sz w:val="24"/>
               </w:rPr>
-              <w:t>25%</w:t>
+              <w:t>50%</w:t>
             </w:r>
           </w:p>
         </w:tc>
@@ -3084,7 +3091,8 @@
               <w:rPr>
                 <w:sz w:val="24"/>
               </w:rPr>
-              <w:t>Phỏng vấn cửa hàng, chụp biểu mẫu</w:t>
+              <w:lastRenderedPageBreak/>
+              <w:t>Lớp dùng chung, trạng thái đơn hàng và chiếc máy (bản nháp)</w:t>
             </w:r>
           </w:p>
         </w:tc>
@@ -3100,7 +3108,7 @@
               <w:rPr>
                 <w:sz w:val="24"/>
               </w:rPr>
-              <w:t>Cả nhóm</w:t>
+              <w:t>Phạm Tuấn Kiệt</w:t>
             </w:r>
           </w:p>
         </w:tc>
@@ -3116,7 +3124,7 @@
               <w:rPr>
                 <w:sz w:val="24"/>
               </w:rPr>
-              <w:t>Dự kiến 14/10/2026</w:t>
+              <w:t>07/10/2026</w:t>
             </w:r>
           </w:p>
         </w:tc>
@@ -3132,7 +3140,7 @@
               <w:rPr>
                 <w:sz w:val="24"/>
               </w:rPr>
-              <w:t>0%</w:t>
+              <w:t>50%</w:t>
             </w:r>
           </w:p>
         </w:tc>
@@ -3153,7 +3161,7 @@
               <w:rPr>
                 <w:sz w:val="24"/>
               </w:rPr>
-              <w:t>Phát bảng hỏi khách hàng (mục tiêu 30 phiếu)</w:t>
+              <w:t>Chốt gói việc cho 5 thành viên</w:t>
             </w:r>
           </w:p>
         </w:tc>
@@ -3185,7 +3193,7 @@
               <w:rPr>
                 <w:sz w:val="24"/>
               </w:rPr>
-              <w:t>Dự kiến 18/10/2026</w:t>
+              <w:t>07/10/2026</w:t>
             </w:r>
           </w:p>
         </w:tc>
@@ -3201,7 +3209,7 @@
               <w:rPr>
                 <w:sz w:val="24"/>
               </w:rPr>
-              <w:t>0%</w:t>
+              <w:t>100%</w:t>
             </w:r>
           </w:p>
         </w:tc>
@@ -3222,8 +3230,214 @@
               <w:rPr>
                 <w:sz w:val="24"/>
               </w:rPr>
-              <w:lastRenderedPageBreak/>
-              <w:t>Đặc tả quy trình và sơ đồ hoạt động của từng gói</w:t>
+              <w:t>Chọn cửa hàng khảo sát, hẹn lịch phỏng vấn</w:t>
+            </w:r>
+          </w:p>
+        </w:tc>
+        <w:tc>
+          <w:tcPr>
+            <w:tcW w:w="1814" w:type="dxa"/>
+          </w:tcPr>
+          <w:p>
+            <w:pPr>
+              <w:spacing w:before="20" w:after="20" w:line="276" w:lineRule="auto"/>
+            </w:pPr>
+            <w:r>
+              <w:rPr>
+                <w:sz w:val="24"/>
+              </w:rPr>
+              <w:t>Cả nhóm</w:t>
+            </w:r>
+          </w:p>
+        </w:tc>
+        <w:tc>
+          <w:tcPr>
+            <w:tcW w:w="1587" w:type="dxa"/>
+          </w:tcPr>
+          <w:p>
+            <w:pPr>
+              <w:spacing w:before="20" w:after="20" w:line="276" w:lineRule="auto"/>
+            </w:pPr>
+            <w:r>
+              <w:rPr>
+                <w:sz w:val="24"/>
+              </w:rPr>
+              <w:t>Dự kiến 11/10/2026</w:t>
+            </w:r>
+          </w:p>
+        </w:tc>
+        <w:tc>
+          <w:tcPr>
+            <w:tcW w:w="1134" w:type="dxa"/>
+          </w:tcPr>
+          <w:p>
+            <w:pPr>
+              <w:spacing w:before="20" w:after="20" w:line="276" w:lineRule="auto"/>
+            </w:pPr>
+            <w:r>
+              <w:rPr>
+                <w:sz w:val="24"/>
+              </w:rPr>
+              <w:t>25%</w:t>
+            </w:r>
+          </w:p>
+        </w:tc>
+      </w:tr>
+      <w:tr>
+        <w:trPr>
+          <w:jc w:val="center"/>
+        </w:trPr>
+        <w:tc>
+          <w:tcPr>
+            <w:tcW w:w="4195" w:type="dxa"/>
+          </w:tcPr>
+          <w:p>
+            <w:pPr>
+              <w:spacing w:before="20" w:after="20" w:line="276" w:lineRule="auto"/>
+            </w:pPr>
+            <w:r>
+              <w:rPr>
+                <w:sz w:val="24"/>
+              </w:rPr>
+              <w:t>Phỏng vấn cửa hàng, chụp biểu mẫu</w:t>
+            </w:r>
+          </w:p>
+        </w:tc>
+        <w:tc>
+          <w:tcPr>
+            <w:tcW w:w="1814" w:type="dxa"/>
+          </w:tcPr>
+          <w:p>
+            <w:pPr>
+              <w:spacing w:before="20" w:after="20" w:line="276" w:lineRule="auto"/>
+            </w:pPr>
+            <w:r>
+              <w:rPr>
+                <w:sz w:val="24"/>
+              </w:rPr>
+              <w:t>Cả nhóm</w:t>
+            </w:r>
+          </w:p>
+        </w:tc>
+        <w:tc>
+          <w:tcPr>
+            <w:tcW w:w="1587" w:type="dxa"/>
+          </w:tcPr>
+          <w:p>
+            <w:pPr>
+              <w:spacing w:before="20" w:after="20" w:line="276" w:lineRule="auto"/>
+            </w:pPr>
+            <w:r>
+              <w:rPr>
+                <w:sz w:val="24"/>
+              </w:rPr>
+              <w:t>Dự kiến 14/10/2026</w:t>
+            </w:r>
+          </w:p>
+        </w:tc>
+        <w:tc>
+          <w:tcPr>
+            <w:tcW w:w="1134" w:type="dxa"/>
+          </w:tcPr>
+          <w:p>
+            <w:pPr>
+              <w:spacing w:before="20" w:after="20" w:line="276" w:lineRule="auto"/>
+            </w:pPr>
+            <w:r>
+              <w:rPr>
+                <w:sz w:val="24"/>
+              </w:rPr>
+              <w:t>0%</w:t>
+            </w:r>
+          </w:p>
+        </w:tc>
+      </w:tr>
+      <w:tr>
+        <w:trPr>
+          <w:jc w:val="center"/>
+        </w:trPr>
+        <w:tc>
+          <w:tcPr>
+            <w:tcW w:w="4195" w:type="dxa"/>
+          </w:tcPr>
+          <w:p>
+            <w:pPr>
+              <w:spacing w:before="20" w:after="20" w:line="276" w:lineRule="auto"/>
+            </w:pPr>
+            <w:r>
+              <w:rPr>
+                <w:sz w:val="24"/>
+              </w:rPr>
+              <w:t>Phát bảng hỏi khách hàng (mục tiêu 30 phiếu)</w:t>
+            </w:r>
+          </w:p>
+        </w:tc>
+        <w:tc>
+          <w:tcPr>
+            <w:tcW w:w="1814" w:type="dxa"/>
+          </w:tcPr>
+          <w:p>
+            <w:pPr>
+              <w:spacing w:before="20" w:after="20" w:line="276" w:lineRule="auto"/>
+            </w:pPr>
+            <w:r>
+              <w:rPr>
+                <w:sz w:val="24"/>
+              </w:rPr>
+              <w:t>Cả nhóm</w:t>
+            </w:r>
+          </w:p>
+        </w:tc>
+        <w:tc>
+          <w:tcPr>
+            <w:tcW w:w="1587" w:type="dxa"/>
+          </w:tcPr>
+          <w:p>
+            <w:pPr>
+              <w:spacing w:before="20" w:after="20" w:line="276" w:lineRule="auto"/>
+            </w:pPr>
+            <w:r>
+              <w:rPr>
+                <w:sz w:val="24"/>
+              </w:rPr>
+              <w:t>Dự kiến 18/10/2026</w:t>
+            </w:r>
+          </w:p>
+        </w:tc>
+        <w:tc>
+          <w:tcPr>
+            <w:tcW w:w="1134" w:type="dxa"/>
+          </w:tcPr>
+          <w:p>
+            <w:pPr>
+              <w:spacing w:before="20" w:after="20" w:line="276" w:lineRule="auto"/>
+            </w:pPr>
+            <w:r>
+              <w:rPr>
+                <w:sz w:val="24"/>
+              </w:rPr>
+              <w:t>0%</w:t>
+            </w:r>
+          </w:p>
+        </w:tc>
+      </w:tr>
+      <w:tr>
+        <w:trPr>
+          <w:jc w:val="center"/>
+        </w:trPr>
+        <w:tc>
+          <w:tcPr>
+            <w:tcW w:w="4195" w:type="dxa"/>
+          </w:tcPr>
+          <w:p>
+            <w:pPr>
+              <w:spacing w:before="20" w:after="20" w:line="276" w:lineRule="auto"/>
+            </w:pPr>
+            <w:r>
+              <w:rPr>
+                <w:sz w:val="24"/>
+              </w:rPr>
+              <w:t>Đặc tả use case nghiệp vụ, sơ đồ đối tượng nghiệp vụ và sơ đồ hoạt động của từng gói</w:t>
             </w:r>
           </w:p>
         </w:tc>
@@ -3287,7 +3501,7 @@
       <w:pPr>
         <w:pStyle w:val="Heading11"/>
       </w:pPr>
-      <w:bookmarkStart w:id="5" w:name="_Toc242251483"/>
+      <w:bookmarkStart w:id="5" w:name="_Toc242361263"/>
       <w:r>
         <w:t>PHẦN 3. KẾT QUẢ ĐÃ CÓ</w:t>
       </w:r>
@@ -3297,7 +3511,7 @@
       <w:pPr>
         <w:pStyle w:val="Heading21"/>
       </w:pPr>
-      <w:bookmarkStart w:id="6" w:name="_Toc242251484"/>
+      <w:bookmarkStart w:id="6" w:name="_Toc242361264"/>
       <w:r>
         <w:t>3.1. PHÂN TÍCH YÊU CẦU BÀI TẬP NHÓM</w:t>
       </w:r>
@@ -3456,7 +3670,7 @@
               <w:rPr>
                 <w:sz w:val="24"/>
               </w:rPr>
-              <w:t>Use case nghiệp vụ tổng; mỗi quy trình có đặc tả và sơ đồ hoạt động có làn</w:t>
+              <w:t>Hiện trạng tổ chức, thuật ngữ, use case nghiệp vụ tổng; mỗi use case nghiệp vụ có đặc tả, sơ đồ đối tượng nghiệp vụ, sơ đồ hoạt động có luồng</w:t>
             </w:r>
           </w:p>
         </w:tc>
@@ -3737,8 +3951,9 @@
       <w:pPr>
         <w:pStyle w:val="Heading21"/>
       </w:pPr>
-      <w:bookmarkStart w:id="7" w:name="_Toc242251485"/>
-      <w:r>
+      <w:bookmarkStart w:id="7" w:name="_Toc242361265"/>
+      <w:r>
+        <w:lastRenderedPageBreak/>
         <w:t>3.2. CHUẨN BỊ KHẢO SÁT</w:t>
       </w:r>
       <w:bookmarkEnd w:id="7"/>
@@ -3803,10 +4018,10 @@
         <w:rPr>
           <w:b/>
         </w:rPr>
-        <w:t>Bảng hỏi khách hàng</w:t>
-      </w:r>
-      <w:r>
-        <w:t xml:space="preserve"> trên Google Form gồm 17 câu, có rẽ nhánh (câu hỏi lý do ít mua trực tuyến chỉ hiện với người ít hoặc chưa mua). Form được tạo tự động bằng script để cả nhóm dùng chung một bản.</w:t>
+        <w:t>Kế hoạch phỏng vấn</w:t>
+      </w:r>
+      <w:r>
+        <w:t xml:space="preserve"> làm đúng ba mẫu của chương 2: kế hoạch phỏng vấn tổng quan (6 chủ đề, yêu cầu từng chủ đề), bảng hướng dẫn buổi phỏng vấn (mục tiêu, thời gian ước lượng từng phần, tổng 52 phút) và biên bản hai cột câu hỏi, ghi nhận (trả lời và kết quả quan sát). Biên bản sẽ gửi lại cửa hàng xem và sửa trước khi dùng.</w:t>
       </w:r>
     </w:p>
     <w:p>
@@ -3816,7 +4031,25 @@
         <w:jc w:val="both"/>
       </w:pPr>
       <w:r>
-        <w:lastRenderedPageBreak/>
+        <w:t xml:space="preserve">- </w:t>
+      </w:r>
+      <w:r>
+        <w:rPr>
+          <w:b/>
+        </w:rPr>
+        <w:t>Bảng hỏi khách hàng</w:t>
+      </w:r>
+      <w:r>
+        <w:t xml:space="preserve"> trên Google Form gồm 17 câu, có rẽ nhánh (câu hỏi lý do ít mua trực tuyến chỉ hiện với người ít hoặc chưa mua). Form được tạo tự động bằng script để cả nhóm dùng chung một bản.</w:t>
+      </w:r>
+    </w:p>
+    <w:p>
+      <w:pPr>
+        <w:spacing w:before="60" w:after="60" w:line="312" w:lineRule="auto"/>
+        <w:ind w:left="454" w:hanging="283"/>
+        <w:jc w:val="both"/>
+      </w:pPr>
+      <w:r>
         <w:t xml:space="preserve">- Trước khi dùng, nhóm </w:t>
       </w:r>
       <w:r>
@@ -3833,7 +4066,7 @@
       <w:pPr>
         <w:pStyle w:val="Heading21"/>
       </w:pPr>
-      <w:bookmarkStart w:id="8" w:name="_Toc242251486"/>
+      <w:bookmarkStart w:id="8" w:name="_Toc242361266"/>
       <w:r>
         <w:t>3.3. MÔ HÌNH HOÁ NGHIỆP VỤ (BẢN NHÁP)</w:t>
       </w:r>
@@ -3846,7 +4079,81 @@
         <w:jc w:val="both"/>
       </w:pPr>
       <w:r>
-        <w:t>Cửa hàng có năm tác nhân nghiệp vụ bên ngoài và năm vai nhân viên nghiệp vụ bên trong. Cửa hàng nhỏ thường một người kiêm nhiều vai; nhóm vẫn tách theo vai và sẽ ghi ai kiêm vai nào sau khi khảo sát.</w:t>
+        <w:t>Nhóm làm theo sáu bước mô hình hoá nghiệp vụ của chương 3: đánh giá hiện trạng tổ chức, xác định thuật ngữ, xác định tác nhân và use case nghiệp vụ, lập mô hình use case, đặc tả use case, xác định thừa tác viên và thực thể. Ký hiệu theo đúng bài giảng: tác nhân nghiệp vụ ghi «business actor», use case nghiệp vụ là elip có gạch chéo, thừa tác viên giao tiếp với môi trường vẽ hình biên, thừa tác viên làm việc bên trong vẽ hình tròn có người, thực thể nghiệp vụ vẽ hình tròn có gạch dưới. Phần đánh giá hiện trạ</w:t>
+      </w:r>
+      <w:r>
+        <w:t>ng (sơ đồ tổ chức, đối tượng liên quan, giới hạn hệ thống, bảng vấn đề) và bảng thuật ngữ đã có khung, đang là giả định và sẽ viết lại sau buổi phỏng vấn.</w:t>
+      </w:r>
+    </w:p>
+    <w:p>
+      <w:pPr>
+        <w:keepNext/>
+        <w:spacing w:before="120" w:after="0" w:line="240" w:lineRule="auto"/>
+        <w:jc w:val="center"/>
+      </w:pPr>
+      <w:r>
+        <w:rPr>
+          <w:noProof/>
+        </w:rPr>
+        <w:lastRenderedPageBreak/>
+        <w:drawing>
+          <wp:inline distT="0" distB="0" distL="0" distR="0" wp14:anchorId="0B605A7A" wp14:editId="0A7BA303">
+            <wp:extent cx="4680000" cy="1544400"/>
+            <wp:effectExtent l="0" t="0" r="0" b="0"/>
+            <wp:docPr id="1204866784" name="Picture 1204866784"/>
+            <wp:cNvGraphicFramePr>
+              <a:graphicFrameLocks xmlns:a="http://schemas.openxmlformats.org/drawingml/2006/main" noChangeAspect="1"/>
+            </wp:cNvGraphicFramePr>
+            <a:graphic xmlns:a="http://schemas.openxmlformats.org/drawingml/2006/main">
+              <a:graphicData uri="http://schemas.openxmlformats.org/drawingml/2006/picture">
+                <pic:pic xmlns:pic="http://schemas.openxmlformats.org/drawingml/2006/picture">
+                  <pic:nvPicPr>
+                    <pic:cNvPr id="0" name="to-chuc-cua-hang.png"/>
+                    <pic:cNvPicPr/>
+                  </pic:nvPicPr>
+                  <pic:blipFill>
+                    <a:blip r:embed="rId9"/>
+                    <a:stretch>
+                      <a:fillRect/>
+                    </a:stretch>
+                  </pic:blipFill>
+                  <pic:spPr>
+                    <a:xfrm>
+                      <a:off x="0" y="0"/>
+                      <a:ext cx="4680000" cy="1544400"/>
+                    </a:xfrm>
+                    <a:prstGeom prst="rect">
+                      <a:avLst/>
+                    </a:prstGeom>
+                  </pic:spPr>
+                </pic:pic>
+              </a:graphicData>
+            </a:graphic>
+          </wp:inline>
+        </w:drawing>
+      </w:r>
+    </w:p>
+    <w:p>
+      <w:pPr>
+        <w:spacing w:before="60" w:after="180" w:line="312" w:lineRule="auto"/>
+        <w:jc w:val="center"/>
+      </w:pPr>
+      <w:r>
+        <w:rPr>
+          <w:i/>
+          <w:sz w:val="24"/>
+        </w:rPr>
+        <w:t>Hình 3.1: Sơ đồ tổ chức cửa hàng (giả định trước khảo sát)</w:t>
+      </w:r>
+    </w:p>
+    <w:p>
+      <w:pPr>
+        <w:spacing w:before="120" w:after="120" w:line="312" w:lineRule="auto"/>
+        <w:ind w:firstLine="567"/>
+        <w:jc w:val="both"/>
+      </w:pPr>
+      <w:r>
+        <w:t>Cửa hàng có năm tác nhân nghiệp vụ và năm thừa tác viên. Thừa tác viên là vai trò chứ không phải chức vụ, nên cửa hàng nhỏ có một người kiêm nhiều vai thì nhóm vẫn tách theo vai và ghi ai kiêm vai nào sau khi khảo sát. Chủ cửa hàng ở trong tổ chức nhưng nằm ngoài hệ thống nghiệp vụ đang xét (chỉ yêu cầu và nhận báo cáo) nên được xem là tác nhân nghiệp vụ.</w:t>
       </w:r>
     </w:p>
     <w:p>
@@ -3860,7 +4167,7 @@
           <w:i/>
           <w:sz w:val="24"/>
         </w:rPr>
-        <w:t>Bảng 3.2: Tác nhân nghiệp vụ và nhân viên nghiệp vụ</w:t>
+        <w:t>Bảng 3.2: Tác nhân nghiệp vụ và thừa tác viên</w:t>
       </w:r>
     </w:p>
     <w:tbl>
@@ -3871,9 +4178,9 @@
         <w:tblLook w:val="04A0" w:firstRow="1" w:lastRow="0" w:firstColumn="1" w:lastColumn="0" w:noHBand="0" w:noVBand="1"/>
       </w:tblPr>
       <w:tblGrid>
-        <w:gridCol w:w="1995"/>
-        <w:gridCol w:w="2432"/>
-        <w:gridCol w:w="4067"/>
+        <w:gridCol w:w="2540"/>
+        <w:gridCol w:w="2323"/>
+        <w:gridCol w:w="3631"/>
       </w:tblGrid>
       <w:tr>
         <w:trPr>
@@ -3882,7 +4189,7 @@
         </w:trPr>
         <w:tc>
           <w:tcPr>
-            <w:tcW w:w="2041" w:type="dxa"/>
+            <w:tcW w:w="2608" w:type="dxa"/>
             <w:shd w:val="clear" w:color="auto" w:fill="D9D9D9"/>
           </w:tcPr>
           <w:p>
@@ -3900,7 +4207,7 @@
         </w:tc>
         <w:tc>
           <w:tcPr>
-            <w:tcW w:w="2494" w:type="dxa"/>
+            <w:tcW w:w="2381" w:type="dxa"/>
             <w:shd w:val="clear" w:color="auto" w:fill="D9D9D9"/>
           </w:tcPr>
           <w:p>
@@ -3918,7 +4225,7 @@
         </w:tc>
         <w:tc>
           <w:tcPr>
-            <w:tcW w:w="4195" w:type="dxa"/>
+            <w:tcW w:w="3742" w:type="dxa"/>
             <w:shd w:val="clear" w:color="auto" w:fill="D9D9D9"/>
           </w:tcPr>
           <w:p>
@@ -3941,7 +4248,7 @@
         </w:trPr>
         <w:tc>
           <w:tcPr>
-            <w:tcW w:w="2041" w:type="dxa"/>
+            <w:tcW w:w="2608" w:type="dxa"/>
           </w:tcPr>
           <w:p>
             <w:pPr>
@@ -3957,7 +4264,7 @@
         </w:tc>
         <w:tc>
           <w:tcPr>
-            <w:tcW w:w="2494" w:type="dxa"/>
+            <w:tcW w:w="2381" w:type="dxa"/>
           </w:tcPr>
           <w:p>
             <w:pPr>
@@ -3973,7 +4280,7 @@
         </w:tc>
         <w:tc>
           <w:tcPr>
-            <w:tcW w:w="4195" w:type="dxa"/>
+            <w:tcW w:w="3742" w:type="dxa"/>
           </w:tcPr>
           <w:p>
             <w:pPr>
@@ -3994,7 +4301,7 @@
         </w:trPr>
         <w:tc>
           <w:tcPr>
-            <w:tcW w:w="2041" w:type="dxa"/>
+            <w:tcW w:w="2608" w:type="dxa"/>
           </w:tcPr>
           <w:p>
             <w:pPr>
@@ -4010,7 +4317,7 @@
         </w:tc>
         <w:tc>
           <w:tcPr>
-            <w:tcW w:w="2494" w:type="dxa"/>
+            <w:tcW w:w="2381" w:type="dxa"/>
           </w:tcPr>
           <w:p>
             <w:pPr>
@@ -4026,7 +4333,7 @@
         </w:tc>
         <w:tc>
           <w:tcPr>
-            <w:tcW w:w="4195" w:type="dxa"/>
+            <w:tcW w:w="3742" w:type="dxa"/>
           </w:tcPr>
           <w:p>
             <w:pPr>
@@ -4047,7 +4354,7 @@
         </w:trPr>
         <w:tc>
           <w:tcPr>
-            <w:tcW w:w="2041" w:type="dxa"/>
+            <w:tcW w:w="2608" w:type="dxa"/>
           </w:tcPr>
           <w:p>
             <w:pPr>
@@ -4063,7 +4370,7 @@
         </w:tc>
         <w:tc>
           <w:tcPr>
-            <w:tcW w:w="2494" w:type="dxa"/>
+            <w:tcW w:w="2381" w:type="dxa"/>
           </w:tcPr>
           <w:p>
             <w:pPr>
@@ -4079,7 +4386,7 @@
         </w:tc>
         <w:tc>
           <w:tcPr>
-            <w:tcW w:w="4195" w:type="dxa"/>
+            <w:tcW w:w="3742" w:type="dxa"/>
           </w:tcPr>
           <w:p>
             <w:pPr>
@@ -4100,7 +4407,7 @@
         </w:trPr>
         <w:tc>
           <w:tcPr>
-            <w:tcW w:w="2041" w:type="dxa"/>
+            <w:tcW w:w="2608" w:type="dxa"/>
           </w:tcPr>
           <w:p>
             <w:pPr>
@@ -4116,7 +4423,7 @@
         </w:tc>
         <w:tc>
           <w:tcPr>
-            <w:tcW w:w="2494" w:type="dxa"/>
+            <w:tcW w:w="2381" w:type="dxa"/>
           </w:tcPr>
           <w:p>
             <w:pPr>
@@ -4132,7 +4439,7 @@
         </w:tc>
         <w:tc>
           <w:tcPr>
-            <w:tcW w:w="4195" w:type="dxa"/>
+            <w:tcW w:w="3742" w:type="dxa"/>
           </w:tcPr>
           <w:p>
             <w:pPr>
@@ -4153,7 +4460,7 @@
         </w:trPr>
         <w:tc>
           <w:tcPr>
-            <w:tcW w:w="2041" w:type="dxa"/>
+            <w:tcW w:w="2608" w:type="dxa"/>
           </w:tcPr>
           <w:p>
             <w:pPr>
@@ -4169,7 +4476,7 @@
         </w:tc>
         <w:tc>
           <w:tcPr>
-            <w:tcW w:w="2494" w:type="dxa"/>
+            <w:tcW w:w="2381" w:type="dxa"/>
           </w:tcPr>
           <w:p>
             <w:pPr>
@@ -4185,17 +4492,17 @@
         </w:tc>
         <w:tc>
           <w:tcPr>
-            <w:tcW w:w="4195" w:type="dxa"/>
-          </w:tcPr>
-          <w:p>
-            <w:pPr>
-              <w:spacing w:before="20" w:after="20" w:line="276" w:lineRule="auto"/>
-            </w:pPr>
-            <w:r>
-              <w:rPr>
-                <w:sz w:val="24"/>
-              </w:rPr>
-              <w:t>Nhận báo cáo, ra quyết định kinh doanh</w:t>
+            <w:tcW w:w="3742" w:type="dxa"/>
+          </w:tcPr>
+          <w:p>
+            <w:pPr>
+              <w:spacing w:before="20" w:after="20" w:line="276" w:lineRule="auto"/>
+            </w:pPr>
+            <w:r>
+              <w:rPr>
+                <w:sz w:val="24"/>
+              </w:rPr>
+              <w:t>Yêu cầu và nhận báo cáo, ra quyết định kinh doanh</w:t>
             </w:r>
           </w:p>
         </w:tc>
@@ -4206,23 +4513,23 @@
         </w:trPr>
         <w:tc>
           <w:tcPr>
-            <w:tcW w:w="2041" w:type="dxa"/>
-          </w:tcPr>
-          <w:p>
-            <w:pPr>
-              <w:spacing w:before="20" w:after="20" w:line="276" w:lineRule="auto"/>
-            </w:pPr>
-            <w:r>
-              <w:rPr>
-                <w:sz w:val="24"/>
-              </w:rPr>
-              <w:t>Nhân viên nghiệp vụ</w:t>
-            </w:r>
-          </w:p>
-        </w:tc>
-        <w:tc>
-          <w:tcPr>
-            <w:tcW w:w="2494" w:type="dxa"/>
+            <w:tcW w:w="2608" w:type="dxa"/>
+          </w:tcPr>
+          <w:p>
+            <w:pPr>
+              <w:spacing w:before="20" w:after="20" w:line="276" w:lineRule="auto"/>
+            </w:pPr>
+            <w:r>
+              <w:rPr>
+                <w:sz w:val="24"/>
+              </w:rPr>
+              <w:t>Thừa tác viên giao tiếp với môi trường</w:t>
+            </w:r>
+          </w:p>
+        </w:tc>
+        <w:tc>
+          <w:tcPr>
+            <w:tcW w:w="2381" w:type="dxa"/>
           </w:tcPr>
           <w:p>
             <w:pPr>
@@ -4238,7 +4545,7 @@
         </w:tc>
         <w:tc>
           <w:tcPr>
-            <w:tcW w:w="4195" w:type="dxa"/>
+            <w:tcW w:w="3742" w:type="dxa"/>
           </w:tcPr>
           <w:p>
             <w:pPr>
@@ -4259,23 +4566,23 @@
         </w:trPr>
         <w:tc>
           <w:tcPr>
-            <w:tcW w:w="2041" w:type="dxa"/>
-          </w:tcPr>
-          <w:p>
-            <w:pPr>
-              <w:spacing w:before="20" w:after="20" w:line="276" w:lineRule="auto"/>
-            </w:pPr>
-            <w:r>
-              <w:rPr>
-                <w:sz w:val="24"/>
-              </w:rPr>
-              <w:t>Nhân viên nghiệp vụ</w:t>
-            </w:r>
-          </w:p>
-        </w:tc>
-        <w:tc>
-          <w:tcPr>
-            <w:tcW w:w="2494" w:type="dxa"/>
+            <w:tcW w:w="2608" w:type="dxa"/>
+          </w:tcPr>
+          <w:p>
+            <w:pPr>
+              <w:spacing w:before="20" w:after="20" w:line="276" w:lineRule="auto"/>
+            </w:pPr>
+            <w:r>
+              <w:rPr>
+                <w:sz w:val="24"/>
+              </w:rPr>
+              <w:t>Thừa tác viên giao tiếp với môi trường</w:t>
+            </w:r>
+          </w:p>
+        </w:tc>
+        <w:tc>
+          <w:tcPr>
+            <w:tcW w:w="2381" w:type="dxa"/>
           </w:tcPr>
           <w:p>
             <w:pPr>
@@ -4291,7 +4598,7 @@
         </w:tc>
         <w:tc>
           <w:tcPr>
-            <w:tcW w:w="4195" w:type="dxa"/>
+            <w:tcW w:w="3742" w:type="dxa"/>
           </w:tcPr>
           <w:p>
             <w:pPr>
@@ -4312,23 +4619,23 @@
         </w:trPr>
         <w:tc>
           <w:tcPr>
-            <w:tcW w:w="2041" w:type="dxa"/>
-          </w:tcPr>
-          <w:p>
-            <w:pPr>
-              <w:spacing w:before="20" w:after="20" w:line="276" w:lineRule="auto"/>
-            </w:pPr>
-            <w:r>
-              <w:rPr>
-                <w:sz w:val="24"/>
-              </w:rPr>
-              <w:t>Nhân viên nghiệp vụ</w:t>
-            </w:r>
-          </w:p>
-        </w:tc>
-        <w:tc>
-          <w:tcPr>
-            <w:tcW w:w="2494" w:type="dxa"/>
+            <w:tcW w:w="2608" w:type="dxa"/>
+          </w:tcPr>
+          <w:p>
+            <w:pPr>
+              <w:spacing w:before="20" w:after="20" w:line="276" w:lineRule="auto"/>
+            </w:pPr>
+            <w:r>
+              <w:rPr>
+                <w:sz w:val="24"/>
+              </w:rPr>
+              <w:t>Thừa tác viên giao tiếp với môi trường</w:t>
+            </w:r>
+          </w:p>
+        </w:tc>
+        <w:tc>
+          <w:tcPr>
+            <w:tcW w:w="2381" w:type="dxa"/>
           </w:tcPr>
           <w:p>
             <w:pPr>
@@ -4344,7 +4651,7 @@
         </w:tc>
         <w:tc>
           <w:tcPr>
-            <w:tcW w:w="4195" w:type="dxa"/>
+            <w:tcW w:w="3742" w:type="dxa"/>
           </w:tcPr>
           <w:p>
             <w:pPr>
@@ -4365,23 +4672,23 @@
         </w:trPr>
         <w:tc>
           <w:tcPr>
-            <w:tcW w:w="2041" w:type="dxa"/>
-          </w:tcPr>
-          <w:p>
-            <w:pPr>
-              <w:spacing w:before="20" w:after="20" w:line="276" w:lineRule="auto"/>
-            </w:pPr>
-            <w:r>
-              <w:rPr>
-                <w:sz w:val="24"/>
-              </w:rPr>
-              <w:t>Nhân viên nghiệp vụ</w:t>
-            </w:r>
-          </w:p>
-        </w:tc>
-        <w:tc>
-          <w:tcPr>
-            <w:tcW w:w="2494" w:type="dxa"/>
+            <w:tcW w:w="2608" w:type="dxa"/>
+          </w:tcPr>
+          <w:p>
+            <w:pPr>
+              <w:spacing w:before="20" w:after="20" w:line="276" w:lineRule="auto"/>
+            </w:pPr>
+            <w:r>
+              <w:rPr>
+                <w:sz w:val="24"/>
+              </w:rPr>
+              <w:t>Thừa tác viên giao tiếp với môi trường</w:t>
+            </w:r>
+          </w:p>
+        </w:tc>
+        <w:tc>
+          <w:tcPr>
+            <w:tcW w:w="2381" w:type="dxa"/>
           </w:tcPr>
           <w:p>
             <w:pPr>
@@ -4397,7 +4704,7 @@
         </w:tc>
         <w:tc>
           <w:tcPr>
-            <w:tcW w:w="4195" w:type="dxa"/>
+            <w:tcW w:w="3742" w:type="dxa"/>
           </w:tcPr>
           <w:p>
             <w:pPr>
@@ -4418,23 +4725,23 @@
         </w:trPr>
         <w:tc>
           <w:tcPr>
-            <w:tcW w:w="2041" w:type="dxa"/>
-          </w:tcPr>
-          <w:p>
-            <w:pPr>
-              <w:spacing w:before="20" w:after="20" w:line="276" w:lineRule="auto"/>
-            </w:pPr>
-            <w:r>
-              <w:rPr>
-                <w:sz w:val="24"/>
-              </w:rPr>
-              <w:t>Nhân viên nghiệp vụ</w:t>
-            </w:r>
-          </w:p>
-        </w:tc>
-        <w:tc>
-          <w:tcPr>
-            <w:tcW w:w="2494" w:type="dxa"/>
+            <w:tcW w:w="2608" w:type="dxa"/>
+          </w:tcPr>
+          <w:p>
+            <w:pPr>
+              <w:spacing w:before="20" w:after="20" w:line="276" w:lineRule="auto"/>
+            </w:pPr>
+            <w:r>
+              <w:rPr>
+                <w:sz w:val="24"/>
+              </w:rPr>
+              <w:t>Thừa tác viên làm việc bên trong</w:t>
+            </w:r>
+          </w:p>
+        </w:tc>
+        <w:tc>
+          <w:tcPr>
+            <w:tcW w:w="2381" w:type="dxa"/>
           </w:tcPr>
           <w:p>
             <w:pPr>
@@ -4450,7 +4757,7 @@
         </w:tc>
         <w:tc>
           <w:tcPr>
-            <w:tcW w:w="4195" w:type="dxa"/>
+            <w:tcW w:w="3742" w:type="dxa"/>
           </w:tcPr>
           <w:p>
             <w:pPr>
@@ -4484,10 +4791,10 @@
         </w:rPr>
         <w:lastRenderedPageBreak/>
         <w:drawing>
-          <wp:inline distT="0" distB="0" distL="0" distR="0" wp14:anchorId="7A91877C" wp14:editId="3C07A01A">
-            <wp:extent cx="3960000" cy="5096667"/>
+          <wp:inline distT="0" distB="0" distL="0" distR="0" wp14:anchorId="44294F67" wp14:editId="7FD80DC9">
+            <wp:extent cx="4860000" cy="3761459"/>
             <wp:effectExtent l="0" t="0" r="0" b="0"/>
-            <wp:docPr id="1204866784" name="Picture 1204866784"/>
+            <wp:docPr id="1204866785" name="Picture 1204866785"/>
             <wp:cNvGraphicFramePr>
               <a:graphicFrameLocks xmlns:a="http://schemas.openxmlformats.org/drawingml/2006/main" noChangeAspect="1"/>
             </wp:cNvGraphicFramePr>
@@ -4499,7 +4806,7 @@
                     <pic:cNvPicPr/>
                   </pic:nvPicPr>
                   <pic:blipFill>
-                    <a:blip r:embed="rId9"/>
+                    <a:blip r:embed="rId10"/>
                     <a:stretch>
                       <a:fillRect/>
                     </a:stretch>
@@ -4507,7 +4814,7 @@
                   <pic:spPr>
                     <a:xfrm>
                       <a:off x="0" y="0"/>
-                      <a:ext cx="3960000" cy="5096667"/>
+                      <a:ext cx="4860000" cy="3761459"/>
                     </a:xfrm>
                     <a:prstGeom prst="rect">
                       <a:avLst/>
@@ -4530,7 +4837,7 @@
           <w:i/>
           <w:sz w:val="24"/>
         </w:rPr>
-        <w:t>Hình 3.1: Sơ đồ use case nghiệp vụ tổng (bản nháp)</w:t>
+        <w:t>Hình 3.2: Sơ đồ use case nghiệp vụ tổng (bản nháp)</w:t>
       </w:r>
     </w:p>
     <w:p>
@@ -4540,7 +4847,52 @@
         <w:jc w:val="both"/>
       </w:pPr>
       <w:r>
-        <w:t>Mỗi use case nghiệp vụ ứng với một quy trình do một gói đặc tả chi tiết. Bảng 3.3 chốt trước các làn (nhân viên nghiệp vụ) và giấy tờ (thực thể nghiệp vụ) để sơ đồ hoạt động của các gói dùng cùng tên.</w:t>
+        <w:t xml:space="preserve">Hai quan hệ giữa các use case nghiệp vụ làm theo ví dụ trong bài giảng: </w:t>
+      </w:r>
+      <w:r>
+        <w:rPr>
+          <w:b/>
+        </w:rPr>
+        <w:t>Lắp đặt tận nơi</w:t>
+      </w:r>
+      <w:r>
+        <w:t xml:space="preserve"> mở rộng (extend) </w:t>
+      </w:r>
+      <w:r>
+        <w:rPr>
+          <w:b/>
+        </w:rPr>
+        <w:t>Giao hàng</w:t>
+      </w:r>
+      <w:r>
+        <w:t xml:space="preserve"> vì chỉ chạy khi sản phẩm cần lắp đặt; </w:t>
+      </w:r>
+      <w:r>
+        <w:rPr>
+          <w:b/>
+        </w:rPr>
+        <w:t>Đổi trả hàng</w:t>
+      </w:r>
+      <w:r>
+        <w:t xml:space="preserve"> và </w:t>
+      </w:r>
+      <w:r>
+        <w:rPr>
+          <w:b/>
+        </w:rPr>
+        <w:t>Bảo hành sản phẩm</w:t>
+      </w:r>
+      <w:r>
+        <w:t xml:space="preserve"> cùng bao hàm (include) </w:t>
+      </w:r>
+      <w:r>
+        <w:rPr>
+          <w:b/>
+        </w:rPr>
+        <w:t>Kiểm tra máy theo số serial</w:t>
+      </w:r>
+      <w:r>
+        <w:t xml:space="preserve"> vì cả hai đều phải xác minh đúng chiếc máy cửa hàng đã bán và ngày mua. Bảng 3.3 chốt trước các luồng (thừa tác viên) và các thực thể nghiệp vụ để sơ đồ đối tượng nghiệp vụ và sơ đồ hoạt động của các gói dùng cùng tên.</w:t>
       </w:r>
     </w:p>
     <w:p>
@@ -4554,7 +4906,7 @@
           <w:i/>
           <w:sz w:val="24"/>
         </w:rPr>
-        <w:t>Bảng 3.3: Hiện thực hoá use case nghiệp vụ</w:t>
+        <w:t>Bảng 3.3: Thừa tác viên và thực thể của từng use case nghiệp vụ</w:t>
       </w:r>
     </w:p>
     <w:tbl>
@@ -4565,10 +4917,10 @@
         <w:tblLook w:val="04A0" w:firstRow="1" w:lastRow="0" w:firstColumn="1" w:lastColumn="0" w:noHBand="0" w:noVBand="1"/>
       </w:tblPr>
       <w:tblGrid>
-        <w:gridCol w:w="2532"/>
-        <w:gridCol w:w="1335"/>
-        <w:gridCol w:w="2421"/>
-        <w:gridCol w:w="2206"/>
+        <w:gridCol w:w="2533"/>
+        <w:gridCol w:w="1336"/>
+        <w:gridCol w:w="2417"/>
+        <w:gridCol w:w="2208"/>
       </w:tblGrid>
       <w:tr>
         <w:trPr>
@@ -4625,7 +4977,7 @@
                 <w:b/>
                 <w:sz w:val="24"/>
               </w:rPr>
-              <w:t>Nhân viên nghiệp vụ</w:t>
+              <w:t>Thừa tác viên</w:t>
             </w:r>
           </w:p>
         </w:tc>
@@ -4712,7 +5064,7 @@
               <w:rPr>
                 <w:sz w:val="24"/>
               </w:rPr>
-              <w:t>Sản phẩm, Bảng giá và khuyến mãi</w:t>
+              <w:t>Thông tin mẫu máy, Bảng giá và khuyến mãi, Chiếc máy (trưng bày)</w:t>
             </w:r>
           </w:p>
         </w:tc>
@@ -4781,7 +5133,7 @@
               <w:rPr>
                 <w:sz w:val="24"/>
               </w:rPr>
-              <w:t>Đơn hàng, Hoá đơn, Phiếu bảo hành</w:t>
+              <w:t>Thông tin mẫu máy, Bảng giá và khuyến mãi, Đơn hàng, Hoá đơn, Phiếu bảo hành, Chiếc máy</w:t>
             </w:r>
           </w:p>
         </w:tc>
@@ -4802,7 +5154,8 @@
               <w:rPr>
                 <w:sz w:val="24"/>
               </w:rPr>
-              <w:t>BUC-03 Giao hàng và lắp đặt</w:t>
+              <w:lastRenderedPageBreak/>
+              <w:t>BUC-03 Giao hàng</w:t>
             </w:r>
           </w:p>
         </w:tc>
@@ -4850,7 +5203,7 @@
               <w:rPr>
                 <w:sz w:val="24"/>
               </w:rPr>
-              <w:t>Phiếu xuất kho, Phiếu giao hàng, Biên bản lắp đặt</w:t>
+              <w:t>Đơn hàng, Phiếu xuất kho, Phiếu giao hàng, Chiếc máy, Sổ nộp tiền</w:t>
             </w:r>
           </w:p>
         </w:tc>
@@ -4871,7 +5224,6 @@
               <w:rPr>
                 <w:sz w:val="24"/>
               </w:rPr>
-              <w:lastRenderedPageBreak/>
               <w:t>BUC-04 Đổi trả hàng</w:t>
             </w:r>
           </w:p>
@@ -4920,7 +5272,7 @@
               <w:rPr>
                 <w:sz w:val="24"/>
               </w:rPr>
-              <w:t>Phiếu đổi trả, Hoá đơn</w:t>
+              <w:t>Phiếu đổi trả, Hoá đơn, Chiếc máy</w:t>
             </w:r>
           </w:p>
         </w:tc>
@@ -4989,7 +5341,7 @@
               <w:rPr>
                 <w:sz w:val="24"/>
               </w:rPr>
-              <w:t>Đơn đặt hàng NCC, Phiếu nhập kho</w:t>
+              <w:t>Đơn đặt hàng NCC, Phiếu nhập kho, Chiếc máy</w:t>
             </w:r>
           </w:p>
         </w:tc>
@@ -5010,7 +5362,7 @@
               <w:rPr>
                 <w:sz w:val="24"/>
               </w:rPr>
-              <w:t>BUC-06 Bảo hành</w:t>
+              <w:t>BUC-06 Bảo hành sản phẩm</w:t>
             </w:r>
           </w:p>
         </w:tc>
@@ -5058,7 +5410,7 @@
               <w:rPr>
                 <w:sz w:val="24"/>
               </w:rPr>
-              <w:t>Phiếu bảo hành, Phiếu tiếp nhận bảo hành</w:t>
+              <w:t>Phiếu bảo hành, Phiếu tiếp nhận bảo hành, Chiếc máy</w:t>
             </w:r>
           </w:p>
         </w:tc>
@@ -5079,7 +5431,7 @@
               <w:rPr>
                 <w:sz w:val="24"/>
               </w:rPr>
-              <w:t>BUC-07 Báo cáo kinh doanh</w:t>
+              <w:t>BUC-07 Lập báo cáo kinh doanh</w:t>
             </w:r>
           </w:p>
         </w:tc>
@@ -5127,7 +5479,145 @@
               <w:rPr>
                 <w:sz w:val="24"/>
               </w:rPr>
-              <w:t>Hoá đơn, Phiếu nhập, Báo cáo kinh doanh</w:t>
+              <w:t>Hoá đơn, Sổ nộp tiền, Phiếu nhập, Phiếu xuất, Phiếu tiếp nhận bảo hành, Chiếc máy, Báo cáo kinh doanh</w:t>
+            </w:r>
+          </w:p>
+        </w:tc>
+      </w:tr>
+      <w:tr>
+        <w:trPr>
+          <w:jc w:val="center"/>
+        </w:trPr>
+        <w:tc>
+          <w:tcPr>
+            <w:tcW w:w="2608" w:type="dxa"/>
+          </w:tcPr>
+          <w:p>
+            <w:pPr>
+              <w:spacing w:before="20" w:after="20" w:line="276" w:lineRule="auto"/>
+            </w:pPr>
+            <w:r>
+              <w:rPr>
+                <w:sz w:val="24"/>
+              </w:rPr>
+              <w:t>BUC-08 Lắp đặt tận nơi</w:t>
+            </w:r>
+          </w:p>
+        </w:tc>
+        <w:tc>
+          <w:tcPr>
+            <w:tcW w:w="1361" w:type="dxa"/>
+          </w:tcPr>
+          <w:p>
+            <w:pPr>
+              <w:spacing w:before="20" w:after="20" w:line="276" w:lineRule="auto"/>
+            </w:pPr>
+            <w:r>
+              <w:rPr>
+                <w:sz w:val="24"/>
+              </w:rPr>
+              <w:t>QT-04, G4</w:t>
+            </w:r>
+          </w:p>
+        </w:tc>
+        <w:tc>
+          <w:tcPr>
+            <w:tcW w:w="2494" w:type="dxa"/>
+          </w:tcPr>
+          <w:p>
+            <w:pPr>
+              <w:spacing w:before="20" w:after="20" w:line="276" w:lineRule="auto"/>
+            </w:pPr>
+            <w:r>
+              <w:rPr>
+                <w:sz w:val="24"/>
+              </w:rPr>
+              <w:t>NV giao hàng – kỹ thuật</w:t>
+            </w:r>
+          </w:p>
+        </w:tc>
+        <w:tc>
+          <w:tcPr>
+            <w:tcW w:w="2268" w:type="dxa"/>
+          </w:tcPr>
+          <w:p>
+            <w:pPr>
+              <w:spacing w:before="20" w:after="20" w:line="276" w:lineRule="auto"/>
+            </w:pPr>
+            <w:r>
+              <w:rPr>
+                <w:sz w:val="24"/>
+              </w:rPr>
+              <w:t>Chiếc máy, Biên bản lắp đặt</w:t>
+            </w:r>
+          </w:p>
+        </w:tc>
+      </w:tr>
+      <w:tr>
+        <w:trPr>
+          <w:jc w:val="center"/>
+        </w:trPr>
+        <w:tc>
+          <w:tcPr>
+            <w:tcW w:w="2608" w:type="dxa"/>
+          </w:tcPr>
+          <w:p>
+            <w:pPr>
+              <w:spacing w:before="20" w:after="20" w:line="276" w:lineRule="auto"/>
+            </w:pPr>
+            <w:r>
+              <w:rPr>
+                <w:sz w:val="24"/>
+              </w:rPr>
+              <w:t>BUC-09 Kiểm tra máy theo số serial</w:t>
+            </w:r>
+          </w:p>
+        </w:tc>
+        <w:tc>
+          <w:tcPr>
+            <w:tcW w:w="1361" w:type="dxa"/>
+          </w:tcPr>
+          <w:p>
+            <w:pPr>
+              <w:spacing w:before="20" w:after="20" w:line="276" w:lineRule="auto"/>
+            </w:pPr>
+            <w:r>
+              <w:rPr>
+                <w:sz w:val="24"/>
+              </w:rPr>
+              <w:t>QT-06, G5</w:t>
+            </w:r>
+          </w:p>
+        </w:tc>
+        <w:tc>
+          <w:tcPr>
+            <w:tcW w:w="2494" w:type="dxa"/>
+          </w:tcPr>
+          <w:p>
+            <w:pPr>
+              <w:spacing w:before="20" w:after="20" w:line="276" w:lineRule="auto"/>
+            </w:pPr>
+            <w:r>
+              <w:rPr>
+                <w:sz w:val="24"/>
+              </w:rPr>
+              <w:t>NV bán hàng</w:t>
+            </w:r>
+          </w:p>
+        </w:tc>
+        <w:tc>
+          <w:tcPr>
+            <w:tcW w:w="2268" w:type="dxa"/>
+          </w:tcPr>
+          <w:p>
+            <w:pPr>
+              <w:spacing w:before="20" w:after="20" w:line="276" w:lineRule="auto"/>
+            </w:pPr>
+            <w:r>
+              <w:rPr>
+                <w:sz w:val="24"/>
+              </w:rPr>
+              <w:t>Chiếc máy, Hoá đơn, Phiếu bảo hành</w:t>
             </w:r>
           </w:p>
         </w:tc>
@@ -5143,7 +5633,7 @@
       <w:pPr>
         <w:pStyle w:val="Heading21"/>
       </w:pPr>
-      <w:bookmarkStart w:id="9" w:name="_Toc242251487"/>
+      <w:bookmarkStart w:id="9" w:name="_Toc242361267"/>
       <w:r>
         <w:t>3.4. MÔ HÌNH HOÁ CHỨC NĂNG (BẢN NHÁP)</w:t>
       </w:r>
@@ -5170,10 +5660,10 @@
           <w:noProof/>
         </w:rPr>
         <w:drawing>
-          <wp:inline distT="0" distB="0" distL="0" distR="0" wp14:anchorId="0B95C942" wp14:editId="0C56AB37">
+          <wp:inline distT="0" distB="0" distL="0" distR="0" wp14:anchorId="1E95E363" wp14:editId="7741211B">
             <wp:extent cx="4320000" cy="1959721"/>
             <wp:effectExtent l="0" t="0" r="0" b="0"/>
-            <wp:docPr id="1204866785" name="Picture 1204866785"/>
+            <wp:docPr id="1204866786" name="Picture 1204866786"/>
             <wp:cNvGraphicFramePr>
               <a:graphicFrameLocks xmlns:a="http://schemas.openxmlformats.org/drawingml/2006/main" noChangeAspect="1"/>
             </wp:cNvGraphicFramePr>
@@ -5185,7 +5675,7 @@
                     <pic:cNvPicPr/>
                   </pic:nvPicPr>
                   <pic:blipFill>
-                    <a:blip r:embed="rId10"/>
+                    <a:blip r:embed="rId11"/>
                     <a:stretch>
                       <a:fillRect/>
                     </a:stretch>
@@ -5216,7 +5706,7 @@
           <w:i/>
           <w:sz w:val="24"/>
         </w:rPr>
-        <w:t>Hình 3.2: Tác nhân hệ thống và quan hệ tổng quát hoá</w:t>
+        <w:t>Hình 3.3: Tác nhân hệ thống và quan hệ tổng quát hoá</w:t>
       </w:r>
     </w:p>
     <w:p>
@@ -5231,10 +5721,10 @@
         </w:rPr>
         <w:lastRenderedPageBreak/>
         <w:drawing>
-          <wp:inline distT="0" distB="0" distL="0" distR="0" wp14:anchorId="73F32655" wp14:editId="52128469">
+          <wp:inline distT="0" distB="0" distL="0" distR="0" wp14:anchorId="18A00857" wp14:editId="4E6CAB13">
             <wp:extent cx="3167455" cy="5039999"/>
             <wp:effectExtent l="0" t="0" r="0" b="0"/>
-            <wp:docPr id="1204866786" name="Picture 1204866786"/>
+            <wp:docPr id="1204866787" name="Picture 1204866787"/>
             <wp:cNvGraphicFramePr>
               <a:graphicFrameLocks xmlns:a="http://schemas.openxmlformats.org/drawingml/2006/main" noChangeAspect="1"/>
             </wp:cNvGraphicFramePr>
@@ -5246,7 +5736,7 @@
                     <pic:cNvPicPr/>
                   </pic:nvPicPr>
                   <pic:blipFill>
-                    <a:blip r:embed="rId11"/>
+                    <a:blip r:embed="rId12"/>
                     <a:stretch>
                       <a:fillRect/>
                     </a:stretch>
@@ -5277,7 +5767,7 @@
           <w:i/>
           <w:sz w:val="24"/>
         </w:rPr>
-        <w:t>Hình 3.3: Use case tổng quát phía khách</w:t>
+        <w:t>Hình 3.4: Use case tổng quát phía khách</w:t>
       </w:r>
     </w:p>
     <w:p>
@@ -5292,10 +5782,10 @@
         </w:rPr>
         <w:lastRenderedPageBreak/>
         <w:drawing>
-          <wp:inline distT="0" distB="0" distL="0" distR="0" wp14:anchorId="2B6EA1F6" wp14:editId="4E4830D5">
+          <wp:inline distT="0" distB="0" distL="0" distR="0" wp14:anchorId="39EBDDF5" wp14:editId="28AEC29E">
             <wp:extent cx="2641208" cy="5040000"/>
             <wp:effectExtent l="0" t="0" r="0" b="0"/>
-            <wp:docPr id="1204866787" name="Picture 1204866787"/>
+            <wp:docPr id="1204866788" name="Picture 1204866788"/>
             <wp:cNvGraphicFramePr>
               <a:graphicFrameLocks xmlns:a="http://schemas.openxmlformats.org/drawingml/2006/main" noChangeAspect="1"/>
             </wp:cNvGraphicFramePr>
@@ -5307,7 +5797,7 @@
                     <pic:cNvPicPr/>
                   </pic:nvPicPr>
                   <pic:blipFill>
-                    <a:blip r:embed="rId12"/>
+                    <a:blip r:embed="rId13"/>
                     <a:stretch>
                       <a:fillRect/>
                     </a:stretch>
@@ -5338,7 +5828,7 @@
           <w:i/>
           <w:sz w:val="24"/>
         </w:rPr>
-        <w:t>Hình 3.4: Use case tổng quát phía cửa hàng</w:t>
+        <w:t>Hình 3.5: Use case tổng quát phía cửa hàng</w:t>
       </w:r>
     </w:p>
     <w:p>
@@ -5822,7 +6312,7 @@
       <w:pPr>
         <w:pStyle w:val="Heading21"/>
       </w:pPr>
-      <w:bookmarkStart w:id="10" w:name="_Toc242251488"/>
+      <w:bookmarkStart w:id="10" w:name="_Toc242361268"/>
       <w:r>
         <w:t>3.5. MÔ HÌNH HOÁ CẤU TRÚC (KHUNG DÙNG CHUNG)</w:t>
       </w:r>
@@ -5867,10 +6357,10 @@
           <w:noProof/>
         </w:rPr>
         <w:drawing>
-          <wp:inline distT="0" distB="0" distL="0" distR="0" wp14:anchorId="42864CBF" wp14:editId="353B0E69">
+          <wp:inline distT="0" distB="0" distL="0" distR="0" wp14:anchorId="536CED3B" wp14:editId="14D5D55D">
             <wp:extent cx="3240000" cy="3091629"/>
             <wp:effectExtent l="0" t="0" r="0" b="0"/>
-            <wp:docPr id="1204866788" name="Picture 1204866788"/>
+            <wp:docPr id="1204866789" name="Picture 1204866789"/>
             <wp:cNvGraphicFramePr>
               <a:graphicFrameLocks xmlns:a="http://schemas.openxmlformats.org/drawingml/2006/main" noChangeAspect="1"/>
             </wp:cNvGraphicFramePr>
@@ -5882,7 +6372,7 @@
                     <pic:cNvPicPr/>
                   </pic:nvPicPr>
                   <pic:blipFill>
-                    <a:blip r:embed="rId13"/>
+                    <a:blip r:embed="rId14"/>
                     <a:stretch>
                       <a:fillRect/>
                     </a:stretch>
@@ -5913,7 +6403,7 @@
           <w:i/>
           <w:sz w:val="24"/>
         </w:rPr>
-        <w:t>Hình 3.5: Lớp dùng chung, phần tài khoản (bản nháp)</w:t>
+        <w:t>Hình 3.6: Lớp dùng chung, phần tài khoản (bản nháp)</w:t>
       </w:r>
     </w:p>
     <w:p>
@@ -5928,10 +6418,10 @@
         </w:rPr>
         <w:lastRenderedPageBreak/>
         <w:drawing>
-          <wp:inline distT="0" distB="0" distL="0" distR="0" wp14:anchorId="35A48F83" wp14:editId="0522655E">
+          <wp:inline distT="0" distB="0" distL="0" distR="0" wp14:anchorId="6A671DF6" wp14:editId="10F543A8">
             <wp:extent cx="4680000" cy="5630254"/>
             <wp:effectExtent l="0" t="0" r="0" b="0"/>
-            <wp:docPr id="1204866789" name="Picture 1204866789"/>
+            <wp:docPr id="1204866790" name="Picture 1204866790"/>
             <wp:cNvGraphicFramePr>
               <a:graphicFrameLocks xmlns:a="http://schemas.openxmlformats.org/drawingml/2006/main" noChangeAspect="1"/>
             </wp:cNvGraphicFramePr>
@@ -5943,7 +6433,7 @@
                     <pic:cNvPicPr/>
                   </pic:nvPicPr>
                   <pic:blipFill>
-                    <a:blip r:embed="rId14"/>
+                    <a:blip r:embed="rId15"/>
                     <a:stretch>
                       <a:fillRect/>
                     </a:stretch>
@@ -5974,7 +6464,7 @@
           <w:i/>
           <w:sz w:val="24"/>
         </w:rPr>
-        <w:t>Hình 3.6: Lớp dùng chung, phần bán hàng (bản nháp)</w:t>
+        <w:t>Hình 3.7: Lớp dùng chung, phần bán hàng (bản nháp)</w:t>
       </w:r>
     </w:p>
     <w:p>
@@ -5989,10 +6479,10 @@
         </w:rPr>
         <w:lastRenderedPageBreak/>
         <w:drawing>
-          <wp:inline distT="0" distB="0" distL="0" distR="0" wp14:anchorId="13977349" wp14:editId="342E6A79">
+          <wp:inline distT="0" distB="0" distL="0" distR="0" wp14:anchorId="2C313CFA" wp14:editId="77FD1E74">
             <wp:extent cx="3600000" cy="4712798"/>
             <wp:effectExtent l="0" t="0" r="0" b="0"/>
-            <wp:docPr id="1204866790" name="Picture 1204866790"/>
+            <wp:docPr id="1204866791" name="Picture 1204866791"/>
             <wp:cNvGraphicFramePr>
               <a:graphicFrameLocks xmlns:a="http://schemas.openxmlformats.org/drawingml/2006/main" noChangeAspect="1"/>
             </wp:cNvGraphicFramePr>
@@ -6004,7 +6494,7 @@
                     <pic:cNvPicPr/>
                   </pic:nvPicPr>
                   <pic:blipFill>
-                    <a:blip r:embed="rId15"/>
+                    <a:blip r:embed="rId16"/>
                     <a:stretch>
                       <a:fillRect/>
                     </a:stretch>
@@ -6035,7 +6525,7 @@
           <w:i/>
           <w:sz w:val="24"/>
         </w:rPr>
-        <w:t>Hình 3.7: Lớp dùng chung, phần theo dõi chiếc máy (bản nháp)</w:t>
+        <w:t>Hình 3.8: Lớp dùng chung, phần theo dõi chiếc máy (bản nháp)</w:t>
       </w:r>
     </w:p>
     <w:p>
@@ -6648,7 +7138,7 @@
       <w:pPr>
         <w:pStyle w:val="Heading21"/>
       </w:pPr>
-      <w:bookmarkStart w:id="11" w:name="_Toc242251489"/>
+      <w:bookmarkStart w:id="11" w:name="_Toc242361269"/>
       <w:r>
         <w:t>3.6. MẪU ĐẶC TẢ VÀ VÍ DỤ</w:t>
       </w:r>
@@ -6661,7 +7151,165 @@
         <w:jc w:val="both"/>
       </w:pPr>
       <w:r>
-        <w:t>Cả năm gói dùng chung một mẫu đặc tả quy trình (mục tiêu, tác nhân, sự kiện bắt đầu, các bước có người làm và giấy tờ, luồng thay thế, quy tắc nghiệp vụ, vấn đề hiện tại) và một mẫu đặc tả use case (tác nhân, điều kiện trước và sau, luồng sự kiện hai cột tác nhân và hệ thống, luồng thay thế, ngoại lệ). Nhóm trưởng làm ví dụ bằng quy trình QT-01 của gói G1; nội dung sẽ viết lại theo lời cửa hàng sau khi phỏng vấn.</w:t>
+        <w:t xml:space="preserve">Bài giảng nêu hai cách đặc tả use case nghiệp vụ là văn bản và sơ đồ; nhóm làm cả hai. Văn bản theo </w:t>
+      </w:r>
+      <w:r>
+        <w:rPr>
+          <w:b/>
+        </w:rPr>
+        <w:t>Mẫu 1</w:t>
+      </w:r>
+      <w:r>
+        <w:t xml:space="preserve"> của bài giảng (giới thiệu, các dòng cơ bản với mỗi bước bắt đầu bằng tên thừa tác viên, các dòng thay thế); sơ đồ gồm sơ đồ đối tượng nghiệp vụ, sơ đồ hoạt động có luồng, thêm sơ đồ tuần tự nghiệp vụ nếu giảng viên yêu cầu. Nhóm trưởng làm ví dụ bằng use case nghiệp vụ BUC-07 của gói G1; các bước là giả định thường gặp và sẽ viết lại theo lời cửa hàng sau khi phỏng vấn.</w:t>
+      </w:r>
+    </w:p>
+    <w:p>
+      <w:pPr>
+        <w:spacing w:before="120" w:after="120" w:line="312" w:lineRule="auto"/>
+        <w:jc w:val="both"/>
+      </w:pPr>
+      <w:r>
+        <w:rPr>
+          <w:b/>
+        </w:rPr>
+        <w:t>Use case nghiệp vụ: Lập báo cáo kinh doanh.</w:t>
+      </w:r>
+      <w:r>
+        <w:t xml:space="preserve"> Use case bắt đầu khi chủ cửa hàng yêu cầu báo cáo tháng. Mục tiêu của use case nhằm cung cấp cho chủ cửa hàng doanh thu, hàng bán chạy, hàng tồn và số máy đang bảo hành để quyết định nhập hàng, khuyến mãi tháng sau.</w:t>
+      </w:r>
+    </w:p>
+    <w:p>
+      <w:pPr>
+        <w:spacing w:before="120" w:after="120" w:line="312" w:lineRule="auto"/>
+      </w:pPr>
+      <w:r>
+        <w:rPr>
+          <w:b/>
+        </w:rPr>
+        <w:t>Các dòng cơ bản:</w:t>
+      </w:r>
+    </w:p>
+    <w:p>
+      <w:pPr>
+        <w:spacing w:before="20" w:after="20" w:line="312" w:lineRule="auto"/>
+        <w:ind w:left="454"/>
+      </w:pPr>
+      <w:r>
+        <w:t>1. Quản lý cửa hàng tiếp nhận yêu cầu báo cáo tháng từ chủ cửa hàng.</w:t>
+      </w:r>
+    </w:p>
+    <w:p>
+      <w:pPr>
+        <w:spacing w:before="20" w:after="20" w:line="312" w:lineRule="auto"/>
+        <w:ind w:left="454"/>
+      </w:pPr>
+      <w:r>
+        <w:t>2. Quản lý cửa hàng giao kế toán lập báo cáo và yêu cầu thủ kho kiểm kê kho.</w:t>
+      </w:r>
+    </w:p>
+    <w:p>
+      <w:pPr>
+        <w:spacing w:before="20" w:after="20" w:line="312" w:lineRule="auto"/>
+        <w:ind w:left="454"/>
+      </w:pPr>
+      <w:r>
+        <w:t>3. Kế toán gom hoá đơn bán hàng trong tháng, cộng doanh thu theo nhóm hàng.</w:t>
+      </w:r>
+    </w:p>
+    <w:p>
+      <w:pPr>
+        <w:spacing w:before="20" w:after="20" w:line="312" w:lineRule="auto"/>
+        <w:ind w:left="454"/>
+      </w:pPr>
+      <w:r>
+        <w:t>4. Kế toán đối chiếu tiền thu khi giao hàng với sổ nộp tiền.</w:t>
+      </w:r>
+    </w:p>
+    <w:p>
+      <w:pPr>
+        <w:spacing w:before="20" w:after="20" w:line="312" w:lineRule="auto"/>
+        <w:ind w:left="454"/>
+      </w:pPr>
+      <w:r>
+        <w:t>5. Thủ kho kiểm kê máy còn trong kho, báo số tồn theo từng mẫu (song song với bước 3, 4).</w:t>
+      </w:r>
+    </w:p>
+    <w:p>
+      <w:pPr>
+        <w:spacing w:before="20" w:after="20" w:line="312" w:lineRule="auto"/>
+        <w:ind w:left="454"/>
+      </w:pPr>
+      <w:r>
+        <w:t>6. Kế toán gom phiếu nhập kho, phiếu tiếp nhận bảo hành trong tháng.</w:t>
+      </w:r>
+    </w:p>
+    <w:p>
+      <w:pPr>
+        <w:spacing w:before="20" w:after="20" w:line="312" w:lineRule="auto"/>
+        <w:ind w:left="454"/>
+      </w:pPr>
+      <w:r>
+        <w:t>7. Kế toán lập báo cáo kinh doanh, gửi quản lý cửa hàng.</w:t>
+      </w:r>
+    </w:p>
+    <w:p>
+      <w:pPr>
+        <w:spacing w:before="20" w:after="20" w:line="312" w:lineRule="auto"/>
+        <w:ind w:left="454"/>
+      </w:pPr>
+      <w:r>
+        <w:t>8. Quản lý cửa hàng xem báo cáo, ghi đề xuất nhập hàng và khuyến mãi vào báo cáo.</w:t>
+      </w:r>
+    </w:p>
+    <w:p>
+      <w:pPr>
+        <w:spacing w:before="20" w:after="20" w:line="312" w:lineRule="auto"/>
+        <w:ind w:left="454"/>
+      </w:pPr>
+      <w:r>
+        <w:t>9. Quản lý cửa hàng trình báo cáo và đề xuất cho chủ cửa hàng duyệt.</w:t>
+      </w:r>
+    </w:p>
+    <w:p>
+      <w:pPr>
+        <w:spacing w:before="120" w:after="120" w:line="312" w:lineRule="auto"/>
+      </w:pPr>
+      <w:r>
+        <w:rPr>
+          <w:b/>
+        </w:rPr>
+        <w:t>Các dòng thay thế:</w:t>
+      </w:r>
+    </w:p>
+    <w:p>
+      <w:pPr>
+        <w:spacing w:before="60" w:after="60" w:line="312" w:lineRule="auto"/>
+        <w:ind w:left="454" w:hanging="283"/>
+        <w:jc w:val="both"/>
+      </w:pPr>
+      <w:r>
+        <w:lastRenderedPageBreak/>
+        <w:t>- Tại bước 4. Xử lý tiền thu lệch: nếu tiền thu khi giao lệch với sổ nộp tiền, kế toán tìm hoá đơn của ngày lệch và ghi lại khoản lệch để đưa vào báo cáo ở bước 7.</w:t>
+      </w:r>
+    </w:p>
+    <w:p>
+      <w:pPr>
+        <w:spacing w:before="60" w:after="60" w:line="312" w:lineRule="auto"/>
+        <w:ind w:left="454" w:hanging="283"/>
+        <w:jc w:val="both"/>
+      </w:pPr>
+      <w:r>
+        <w:t>- Tại bước 5. Xử lý số kiểm kê lệch: nếu số máy đếm được lệch với sổ, thủ kho kiểm lại theo phiếu nhập kho, phiếu xuất kho trước khi báo số tồn.</w:t>
+      </w:r>
+    </w:p>
+    <w:p>
+      <w:pPr>
+        <w:spacing w:before="60" w:after="60" w:line="312" w:lineRule="auto"/>
+        <w:ind w:left="454" w:hanging="283"/>
+        <w:jc w:val="both"/>
+      </w:pPr>
+      <w:r>
+        <w:t>- Tại bước 9. Xử lý đề xuất chưa được duyệt: nếu chủ cửa hàng chưa đồng ý, quản lý cửa hàng sửa đề xuất theo ý chủ rồi trình lại (lặp lại bước 9).</w:t>
       </w:r>
     </w:p>
     <w:p>
@@ -6674,12 +7322,72 @@
         <w:rPr>
           <w:noProof/>
         </w:rPr>
+        <w:drawing>
+          <wp:inline distT="0" distB="0" distL="0" distR="0" wp14:anchorId="44864DF6" wp14:editId="6F69C017">
+            <wp:extent cx="5040000" cy="2616923"/>
+            <wp:effectExtent l="0" t="0" r="0" b="0"/>
+            <wp:docPr id="1204866792" name="Picture 1204866792"/>
+            <wp:cNvGraphicFramePr>
+              <a:graphicFrameLocks xmlns:a="http://schemas.openxmlformats.org/drawingml/2006/main" noChangeAspect="1"/>
+            </wp:cNvGraphicFramePr>
+            <a:graphic xmlns:a="http://schemas.openxmlformats.org/drawingml/2006/main">
+              <a:graphicData uri="http://schemas.openxmlformats.org/drawingml/2006/picture">
+                <pic:pic xmlns:pic="http://schemas.openxmlformats.org/drawingml/2006/picture">
+                  <pic:nvPicPr>
+                    <pic:cNvPr id="0" name="doi-tuong-buc07.png"/>
+                    <pic:cNvPicPr/>
+                  </pic:nvPicPr>
+                  <pic:blipFill>
+                    <a:blip r:embed="rId17"/>
+                    <a:stretch>
+                      <a:fillRect/>
+                    </a:stretch>
+                  </pic:blipFill>
+                  <pic:spPr>
+                    <a:xfrm>
+                      <a:off x="0" y="0"/>
+                      <a:ext cx="5040000" cy="2616923"/>
+                    </a:xfrm>
+                    <a:prstGeom prst="rect">
+                      <a:avLst/>
+                    </a:prstGeom>
+                  </pic:spPr>
+                </pic:pic>
+              </a:graphicData>
+            </a:graphic>
+          </wp:inline>
+        </w:drawing>
+      </w:r>
+    </w:p>
+    <w:p>
+      <w:pPr>
+        <w:spacing w:before="60" w:after="180" w:line="312" w:lineRule="auto"/>
+        <w:jc w:val="center"/>
+      </w:pPr>
+      <w:r>
+        <w:rPr>
+          <w:i/>
+          <w:sz w:val="24"/>
+        </w:rPr>
+        <w:t>Hình 3.9: Sơ đồ đối tượng nghiệp vụ BUC-07 Lập báo cáo kinh doanh</w:t>
+      </w:r>
+    </w:p>
+    <w:p>
+      <w:pPr>
+        <w:keepNext/>
+        <w:spacing w:before="120" w:after="0" w:line="240" w:lineRule="auto"/>
+        <w:jc w:val="center"/>
+      </w:pPr>
+      <w:r>
+        <w:rPr>
+          <w:noProof/>
+        </w:rPr>
         <w:lastRenderedPageBreak/>
         <w:drawing>
-          <wp:inline distT="0" distB="0" distL="0" distR="0" wp14:anchorId="73B76B36" wp14:editId="5E98ECDA">
-            <wp:extent cx="4845835" cy="6480000"/>
+          <wp:inline distT="0" distB="0" distL="0" distR="0" wp14:anchorId="46FB1782" wp14:editId="29C1B876">
+            <wp:extent cx="5040000" cy="7062761"/>
             <wp:effectExtent l="0" t="0" r="0" b="0"/>
-            <wp:docPr id="1204866791" name="Picture 1204866791"/>
+            <wp:docPr id="1204866793" name="Picture 1204866793"/>
             <wp:cNvGraphicFramePr>
               <a:graphicFrameLocks xmlns:a="http://schemas.openxmlformats.org/drawingml/2006/main" noChangeAspect="1"/>
             </wp:cNvGraphicFramePr>
@@ -6691,7 +7399,7 @@
                     <pic:cNvPicPr/>
                   </pic:nvPicPr>
                   <pic:blipFill>
-                    <a:blip r:embed="rId16"/>
+                    <a:blip r:embed="rId18"/>
                     <a:stretch>
                       <a:fillRect/>
                     </a:stretch>
@@ -6699,7 +7407,7 @@
                   <pic:spPr>
                     <a:xfrm>
                       <a:off x="0" y="0"/>
-                      <a:ext cx="4845835" cy="6480000"/>
+                      <a:ext cx="5040000" cy="7062761"/>
                     </a:xfrm>
                     <a:prstGeom prst="rect">
                       <a:avLst/>
@@ -6722,7 +7430,17 @@
           <w:i/>
           <w:sz w:val="24"/>
         </w:rPr>
-        <w:t>Hình 3.8: Ví dụ sơ đồ hoạt động QT-01 Lập báo cáo kinh doanh cuối tháng</w:t>
+        <w:t>Hình 3.10: Sơ đồ hoạt động BUC-07 Lập báo cáo kinh doanh</w:t>
+      </w:r>
+    </w:p>
+    <w:p>
+      <w:pPr>
+        <w:spacing w:before="120" w:after="120" w:line="312" w:lineRule="auto"/>
+        <w:ind w:firstLine="567"/>
+        <w:jc w:val="both"/>
+      </w:pPr>
+      <w:r>
+        <w:t>Mẫu đặc tả use case hệ thống gồm tác nhân, điều kiện trước và sau, luồng sự kiện hai cột tác nhân và hệ thống, luồng thay thế, ngoại lệ; ví dụ của G1 là use case Đăng nhập (Bảng 3.6).</w:t>
       </w:r>
     </w:p>
     <w:p>
@@ -6736,6 +7454,7 @@
           <w:i/>
           <w:sz w:val="24"/>
         </w:rPr>
+        <w:lastRenderedPageBreak/>
         <w:t>Bảng 3.6: Ví dụ đặc tả UC-HT-01 Đăng nhập (luồng chính)</w:t>
       </w:r>
     </w:p>
@@ -7032,7 +7751,7 @@
       <w:pPr>
         <w:pStyle w:val="Heading21"/>
       </w:pPr>
-      <w:bookmarkStart w:id="12" w:name="_Toc242251490"/>
+      <w:bookmarkStart w:id="12" w:name="_Toc242361270"/>
       <w:r>
         <w:t>3.7. BỘ GIAO DIỆN CHUNG</w:t>
       </w:r>
@@ -7068,10 +7787,10 @@
           <w:noProof/>
         </w:rPr>
         <w:drawing>
-          <wp:inline distT="0" distB="0" distL="0" distR="0" wp14:anchorId="2BC35950" wp14:editId="00461E0B">
+          <wp:inline distT="0" distB="0" distL="0" distR="0" wp14:anchorId="07CE3F5E" wp14:editId="0E61AAFB">
             <wp:extent cx="5400000" cy="3562500"/>
             <wp:effectExtent l="0" t="0" r="0" b="0"/>
-            <wp:docPr id="1204866792" name="Picture 1204866792"/>
+            <wp:docPr id="1204866794" name="Picture 1204866794"/>
             <wp:cNvGraphicFramePr>
               <a:graphicFrameLocks xmlns:a="http://schemas.openxmlformats.org/drawingml/2006/main" noChangeAspect="1"/>
             </wp:cNvGraphicFramePr>
@@ -7083,7 +7802,7 @@
                     <pic:cNvPicPr/>
                   </pic:nvPicPr>
                   <pic:blipFill>
-                    <a:blip r:embed="rId17"/>
+                    <a:blip r:embed="rId19"/>
                     <a:stretch>
                       <a:fillRect/>
                     </a:stretch>
@@ -7114,7 +7833,7 @@
           <w:i/>
           <w:sz w:val="24"/>
         </w:rPr>
-        <w:t>Hình 3.9: Màn hình danh sách sản phẩm có bộ lọc (phía khách, G2)</w:t>
+        <w:t>Hình 3.11: Màn hình danh sách sản phẩm có bộ lọc (phía khách, G2)</w:t>
       </w:r>
     </w:p>
     <w:p>
@@ -7129,10 +7848,10 @@
         </w:rPr>
         <w:lastRenderedPageBreak/>
         <w:drawing>
-          <wp:inline distT="0" distB="0" distL="0" distR="0" wp14:anchorId="1CFB4684" wp14:editId="6ECD0A79">
+          <wp:inline distT="0" distB="0" distL="0" distR="0" wp14:anchorId="53E90AA4" wp14:editId="2E4A1CE8">
             <wp:extent cx="5400000" cy="3375000"/>
             <wp:effectExtent l="0" t="0" r="0" b="0"/>
-            <wp:docPr id="1204866793" name="Picture 1204866793"/>
+            <wp:docPr id="1204866795" name="Picture 1204866795"/>
             <wp:cNvGraphicFramePr>
               <a:graphicFrameLocks xmlns:a="http://schemas.openxmlformats.org/drawingml/2006/main" noChangeAspect="1"/>
             </wp:cNvGraphicFramePr>
@@ -7144,7 +7863,7 @@
                     <pic:cNvPicPr/>
                   </pic:nvPicPr>
                   <pic:blipFill>
-                    <a:blip r:embed="rId18"/>
+                    <a:blip r:embed="rId20"/>
                     <a:stretch>
                       <a:fillRect/>
                     </a:stretch>
@@ -7175,14 +7894,14 @@
           <w:i/>
           <w:sz w:val="24"/>
         </w:rPr>
-        <w:t>Hình 3.10: Màn hình danh sách đơn hàng (phía nhân viên, G4)</w:t>
+        <w:t>Hình 3.12: Màn hình danh sách đơn hàng (phía nhân viên, G4)</w:t>
       </w:r>
     </w:p>
     <w:p>
       <w:pPr>
         <w:pStyle w:val="Heading11"/>
       </w:pPr>
-      <w:bookmarkStart w:id="13" w:name="_Toc242251491"/>
+      <w:bookmarkStart w:id="13" w:name="_Toc242361271"/>
       <w:r>
         <w:t>PHẦN 4. KẾ HOẠCH TIẾP THEO</w:t>
       </w:r>
@@ -7495,7 +8214,7 @@
               <w:rPr>
                 <w:sz w:val="24"/>
               </w:rPr>
-              <w:t>Đặc tả và sơ đồ hoạt động các quy trình; chỉnh use case nghiệp vụ tổng</w:t>
+              <w:t>Hiện trạng tổ chức, thuật ngữ; đặc tả Mẫu 1, sơ đồ đối tượng nghiệp vụ, sơ đồ hoạt động từng use case nghiệp vụ; chỉnh use case nghiệp vụ tổng</w:t>
             </w:r>
           </w:p>
         </w:tc>
@@ -7812,6 +8531,7 @@
               <w:rPr>
                 <w:sz w:val="24"/>
               </w:rPr>
+              <w:lastRenderedPageBreak/>
               <w:t>15</w:t>
             </w:r>
           </w:p>
@@ -7952,7 +8672,7 @@
       <w:pPr>
         <w:pStyle w:val="Heading11"/>
       </w:pPr>
-      <w:bookmarkStart w:id="14" w:name="_Toc242251492"/>
+      <w:bookmarkStart w:id="14" w:name="_Toc242361272"/>
       <w:r>
         <w:t>PHẦN 5. KHÓ KHĂN VÀ ĐỀ XUẤT</w:t>
       </w:r>
@@ -7993,93 +8713,14 @@
         <w:t>Chưa chốt công cụ vẽ.</w:t>
       </w:r>
       <w:r>
-        <w:t xml:space="preserve"> Nhóm đang vẽ bằng công cụ dạng chữ để dễ sửa chung và sẽ vẽ lại bằng công cụ giảng viên yêu cầu (đề cương nêu Rational Rose, PowerDesigner).</w:t>
-      </w:r>
-    </w:p>
-    <w:p>
-      <w:pPr>
-        <w:spacing w:before="60" w:after="60" w:line="312" w:lineRule="auto"/>
-        <w:ind w:left="454" w:hanging="283"/>
-        <w:jc w:val="both"/>
-      </w:pPr>
-      <w:r>
-        <w:t xml:space="preserve">- </w:t>
-      </w:r>
-      <w:r>
-        <w:rPr>
-          <w:b/>
-        </w:rPr>
-        <w:t>Thành viên bắt đầu chậm.</w:t>
-      </w:r>
-      <w:r>
-        <w:t xml:space="preserve"> Tuần 7 chủ yếu nhóm trưởng làm phần dùng chung; từ tuần 8 mỗi thành viên đã có gói việc, mẫu đặc tả và hạn cụ thể trên trang tiến độ, có họp mỗi tuần và biên bản.</w:t>
-      </w:r>
-    </w:p>
-    <w:p>
-      <w:pPr>
-        <w:spacing w:before="120" w:after="120" w:line="312" w:lineRule="auto"/>
-        <w:ind w:firstLine="567"/>
-        <w:jc w:val="both"/>
-      </w:pPr>
-      <w:r>
-        <w:t>Nhóm xin ý kiến giảng viên về các điểm sau:</w:t>
-      </w:r>
-    </w:p>
-    <w:p>
-      <w:pPr>
-        <w:spacing w:before="60" w:after="60" w:line="312" w:lineRule="auto"/>
-        <w:ind w:left="737" w:hanging="283"/>
-        <w:jc w:val="both"/>
-      </w:pPr>
-      <w:r>
-        <w:t>+ Hạn và hình thức nộp bài tập nhóm, có trình bày hay vấn đáp không.</w:t>
-      </w:r>
-    </w:p>
-    <w:p>
-      <w:pPr>
-        <w:spacing w:before="60" w:after="60" w:line="312" w:lineRule="auto"/>
-        <w:ind w:left="737" w:hanging="283"/>
-        <w:jc w:val="both"/>
-      </w:pPr>
-      <w:r>
-        <w:t>+ Có bắt buộc khảo sát một cửa hàng thật không.</w:t>
-      </w:r>
-    </w:p>
-    <w:p>
-      <w:pPr>
-        <w:spacing w:before="60" w:after="60" w:line="312" w:lineRule="auto"/>
-        <w:ind w:left="737" w:hanging="283"/>
-        <w:jc w:val="both"/>
-      </w:pPr>
-      <w:r>
-        <w:t>+ Công cụ vẽ bắt buộc và có phải nộp kèm tệp mô hình không.</w:t>
-      </w:r>
-    </w:p>
-    <w:p>
-      <w:pPr>
-        <w:spacing w:before="60" w:after="60" w:line="312" w:lineRule="auto"/>
-        <w:ind w:left="737" w:hanging="283"/>
-        <w:jc w:val="both"/>
-      </w:pPr>
-      <w:r>
-        <w:t>+ Chủ cửa hàng (người nhận báo cáo) có được đặt là tác nhân nghiệp vụ của use case nghiệp vụ Báo cáo kinh doanh không.</w:t>
-      </w:r>
-    </w:p>
-    <w:p>
-      <w:pPr>
-        <w:spacing w:before="60" w:after="60" w:line="312" w:lineRule="auto"/>
-        <w:ind w:left="737" w:hanging="283"/>
-        <w:jc w:val="both"/>
-      </w:pPr>
-      <w:r>
-        <w:t>+ Tiêu chí Phối hợp nhóm được chấm dựa trên những minh chứng nào.</w:t>
+        <w:t xml:space="preserve"> Sơ đồ chung đang vẽ bằng công cụ dạng chữ để dễ sửa chung nhưng theo đúng ký hiệu Rational Rose trong bài giảng chương 3; nhóm sẽ vẽ lại bằng công cụ giảng viên yêu cầu (bài giảng và đề cương nêu Rational Rose, PowerDesigner).</w:t>
       </w:r>
     </w:p>
     <w:p>
       <w:pPr>
         <w:pStyle w:val="Heading11"/>
       </w:pPr>
-      <w:bookmarkStart w:id="15" w:name="_Toc242251493"/>
+      <w:bookmarkStart w:id="15" w:name="_Toc242361273"/>
       <w:r>
         <w:t>TÀI LIỆU THAM KHẢO</w:t>
       </w:r>
@@ -8095,6 +8736,8 @@
       </w:r>
       <w:r>
         <w:tab/>
+      </w:r>
+      <w:r>
         <w:t>Trường Đại học Công Thương TP.HCM, Khoa Công nghệ thông tin, Đề cương học phần Phân tích thiết kế hệ thống thông tin (mã 0101003615), bản cập nhật 22/01/2026.</w:t>
       </w:r>
     </w:p>
@@ -8108,7 +8751,7 @@
       </w:r>
       <w:r>
         <w:tab/>
-        <w:t>Phạm Nguyễn Cương, Nguyễn Trần Minh Thư, Hồ Bảo Quốc, Giáo trình Phân tích thiết kế hệ thống thông tin theo hướng đối tượng, NXB Khoa học và Kỹ thuật, 2016.</w:t>
+        <w:t>Bộ môn Hệ thống thông tin, Khoa Công nghệ thông tin, Trường Đại học Công Thương TP.HCM, Bài giảng Phân tích thiết kế hệ thống thông tin: Chương 1 Tổng quan về hệ thống thông tin; Chương 1.2 Giới thiệu công cụ UML; Chương 2 Xác định yêu cầu; Chương 3 Mô hình hoá nghiệp vụ.</w:t>
       </w:r>
     </w:p>
     <w:p>
@@ -8123,7 +8766,7 @@
         <w:tab/>
       </w:r>
       <w:r>
-        <w:t>A. Dennis, B. H. Wixom, D. Tegarden, Systems Analysis and Design: An Object-Oriented Approach with UML, 3rd ed., John Wiley &amp; Sons, 2015.</w:t>
+        <w:t>Phạm Nguyễn Cương, Nguyễn Trần Minh Thư, Hồ Bảo Quốc, Giáo trình Phân tích thiết kế hệ thống thông tin theo hướng đối tượng, NXB Khoa học và Kỹ thuật, 2016.</w:t>
       </w:r>
     </w:p>
     <w:p>
@@ -8136,7 +8779,7 @@
       </w:r>
       <w:r>
         <w:tab/>
-        <w:t>G. Booch, J. Rumbaugh, I. Jacobson, The Unified Modeling Language User Guide, Addison-Wesley.</w:t>
+        <w:t>A. Dennis, B. H. Wixom, D. Tegarden, Systems Analysis and Design: An Object-Oriented Approach with UML, 3rd ed., John Wiley &amp; Sons, 2015.</w:t>
       </w:r>
     </w:p>
     <w:p>
@@ -8149,11 +8792,24 @@
       </w:r>
       <w:r>
         <w:tab/>
+        <w:t>G. Booch, J. Rumbaugh, I. Jacobson, The Unified Modeling Language User Guide, Addison-Wesley.</w:t>
+      </w:r>
+    </w:p>
+    <w:p>
+      <w:pPr>
+        <w:spacing w:before="60" w:after="60" w:line="312" w:lineRule="auto"/>
+        <w:ind w:left="510" w:hanging="510"/>
+      </w:pPr>
+      <w:r>
+        <w:t>[6]</w:t>
+      </w:r>
+      <w:r>
+        <w:tab/>
         <w:t>Khoa Công nghệ thông tin, Trường Đại học Công Thương TP.HCM, Mẫu báo cáo đồ án, khóa luận, fit.huit.edu.vn.</w:t>
       </w:r>
     </w:p>
     <w:sectPr>
-      <w:footerReference w:type="default" r:id="rId19"/>
+      <w:footerReference w:type="default" r:id="rId21"/>
       <w:pgSz w:w="11907" w:h="16840" w:code="9"/>
       <w:pgMar w:top="1418" w:right="1418" w:bottom="1418" w:left="1985" w:header="720" w:footer="720" w:gutter="0"/>
       <w:pgNumType w:start="1"/>
@@ -9402,7 +10058,7 @@
     <w:autoRedefine/>
     <w:uiPriority w:val="39"/>
     <w:unhideWhenUsed/>
-    <w:rsid w:val="00766609"/>
+    <w:rsid w:val="00F57E40"/>
     <w:pPr>
       <w:spacing w:after="100"/>
     </w:pPr>
@@ -9414,7 +10070,7 @@
     <w:autoRedefine/>
     <w:uiPriority w:val="39"/>
     <w:unhideWhenUsed/>
-    <w:rsid w:val="00766609"/>
+    <w:rsid w:val="00F57E40"/>
     <w:pPr>
       <w:spacing w:after="100"/>
       <w:ind w:left="260"/>

</xml_diff>

<commit_message>
Bao cao tien do: sua lich con sot thanh 9 tuan (tuan 8 toi tuan 16)
</commit_message>
<xml_diff>
--- a/bao-cao/BaoCao_TienDo_Nhom4_PTTKHTTT.docx
+++ b/bao-cao/BaoCao_TienDo_Nhom4_PTTKHTTT.docx
@@ -543,7 +543,7 @@
       <w:r>
         <w:fldChar w:fldCharType="separate"/>
       </w:r>
-      <w:hyperlink w:anchor="_Toc242361258" w:history="1">
+      <w:hyperlink w:anchor="_Toc242361986" w:history="1">
         <w:r>
           <w:rPr>
             <w:rStyle w:val="Hyperlink"/>
@@ -570,7 +570,7 @@
             <w:noProof/>
             <w:webHidden/>
           </w:rPr>
-          <w:instrText xml:space="preserve"> PAGEREF _Toc242361258 \h </w:instrText>
+          <w:instrText xml:space="preserve"> PAGEREF _Toc242361986 \h </w:instrText>
         </w:r>
         <w:r>
           <w:rPr>
@@ -614,7 +614,7 @@
           <w:szCs w:val="24"/>
         </w:rPr>
       </w:pPr>
-      <w:hyperlink w:anchor="_Toc242361259" w:history="1">
+      <w:hyperlink w:anchor="_Toc242361987" w:history="1">
         <w:r>
           <w:rPr>
             <w:rStyle w:val="Hyperlink"/>
@@ -641,7 +641,7 @@
             <w:noProof/>
             <w:webHidden/>
           </w:rPr>
-          <w:instrText xml:space="preserve"> PAGEREF _Toc242361259 \h </w:instrText>
+          <w:instrText xml:space="preserve"> PAGEREF _Toc242361987 \h </w:instrText>
         </w:r>
         <w:r>
           <w:rPr>
@@ -685,7 +685,7 @@
           <w:szCs w:val="24"/>
         </w:rPr>
       </w:pPr>
-      <w:hyperlink w:anchor="_Toc242361260" w:history="1">
+      <w:hyperlink w:anchor="_Toc242361988" w:history="1">
         <w:r>
           <w:rPr>
             <w:rStyle w:val="Hyperlink"/>
@@ -712,7 +712,7 @@
             <w:noProof/>
             <w:webHidden/>
           </w:rPr>
-          <w:instrText xml:space="preserve"> PAGEREF _Toc242361260 \h </w:instrText>
+          <w:instrText xml:space="preserve"> PAGEREF _Toc242361988 \h </w:instrText>
         </w:r>
         <w:r>
           <w:rPr>
@@ -756,7 +756,7 @@
           <w:szCs w:val="24"/>
         </w:rPr>
       </w:pPr>
-      <w:hyperlink w:anchor="_Toc242361261" w:history="1">
+      <w:hyperlink w:anchor="_Toc242361989" w:history="1">
         <w:r>
           <w:rPr>
             <w:rStyle w:val="Hyperlink"/>
@@ -783,7 +783,7 @@
             <w:noProof/>
             <w:webHidden/>
           </w:rPr>
-          <w:instrText xml:space="preserve"> PAGEREF _Toc242361261 \h </w:instrText>
+          <w:instrText xml:space="preserve"> PAGEREF _Toc242361989 \h </w:instrText>
         </w:r>
         <w:r>
           <w:rPr>
@@ -827,7 +827,7 @@
           <w:szCs w:val="24"/>
         </w:rPr>
       </w:pPr>
-      <w:hyperlink w:anchor="_Toc242361262" w:history="1">
+      <w:hyperlink w:anchor="_Toc242361990" w:history="1">
         <w:r>
           <w:rPr>
             <w:rStyle w:val="Hyperlink"/>
@@ -854,7 +854,7 @@
             <w:noProof/>
             <w:webHidden/>
           </w:rPr>
-          <w:instrText xml:space="preserve"> PAGEREF _Toc242361262 \h </w:instrText>
+          <w:instrText xml:space="preserve"> PAGEREF _Toc242361990 \h </w:instrText>
         </w:r>
         <w:r>
           <w:rPr>
@@ -898,7 +898,7 @@
           <w:szCs w:val="24"/>
         </w:rPr>
       </w:pPr>
-      <w:hyperlink w:anchor="_Toc242361263" w:history="1">
+      <w:hyperlink w:anchor="_Toc242361991" w:history="1">
         <w:r>
           <w:rPr>
             <w:rStyle w:val="Hyperlink"/>
@@ -925,7 +925,7 @@
             <w:noProof/>
             <w:webHidden/>
           </w:rPr>
-          <w:instrText xml:space="preserve"> PAGEREF _Toc242361263 \h </w:instrText>
+          <w:instrText xml:space="preserve"> PAGEREF _Toc242361991 \h </w:instrText>
         </w:r>
         <w:r>
           <w:rPr>
@@ -969,7 +969,7 @@
           <w:szCs w:val="24"/>
         </w:rPr>
       </w:pPr>
-      <w:hyperlink w:anchor="_Toc242361264" w:history="1">
+      <w:hyperlink w:anchor="_Toc242361992" w:history="1">
         <w:r>
           <w:rPr>
             <w:rStyle w:val="Hyperlink"/>
@@ -996,7 +996,7 @@
             <w:noProof/>
             <w:webHidden/>
           </w:rPr>
-          <w:instrText xml:space="preserve"> PAGEREF _Toc242361264 \h </w:instrText>
+          <w:instrText xml:space="preserve"> PAGEREF _Toc242361992 \h </w:instrText>
         </w:r>
         <w:r>
           <w:rPr>
@@ -1040,7 +1040,7 @@
           <w:szCs w:val="24"/>
         </w:rPr>
       </w:pPr>
-      <w:hyperlink w:anchor="_Toc242361265" w:history="1">
+      <w:hyperlink w:anchor="_Toc242361993" w:history="1">
         <w:r>
           <w:rPr>
             <w:rStyle w:val="Hyperlink"/>
@@ -1067,7 +1067,7 @@
             <w:noProof/>
             <w:webHidden/>
           </w:rPr>
-          <w:instrText xml:space="preserve"> PAGEREF _Toc242361265 \h </w:instrText>
+          <w:instrText xml:space="preserve"> PAGEREF _Toc242361993 \h </w:instrText>
         </w:r>
         <w:r>
           <w:rPr>
@@ -1111,7 +1111,7 @@
           <w:szCs w:val="24"/>
         </w:rPr>
       </w:pPr>
-      <w:hyperlink w:anchor="_Toc242361266" w:history="1">
+      <w:hyperlink w:anchor="_Toc242361994" w:history="1">
         <w:r>
           <w:rPr>
             <w:rStyle w:val="Hyperlink"/>
@@ -1138,7 +1138,7 @@
             <w:noProof/>
             <w:webHidden/>
           </w:rPr>
-          <w:instrText xml:space="preserve"> PAGEREF _Toc242361266 \h </w:instrText>
+          <w:instrText xml:space="preserve"> PAGEREF _Toc242361994 \h </w:instrText>
         </w:r>
         <w:r>
           <w:rPr>
@@ -1182,7 +1182,7 @@
           <w:szCs w:val="24"/>
         </w:rPr>
       </w:pPr>
-      <w:hyperlink w:anchor="_Toc242361267" w:history="1">
+      <w:hyperlink w:anchor="_Toc242361995" w:history="1">
         <w:r>
           <w:rPr>
             <w:rStyle w:val="Hyperlink"/>
@@ -1209,7 +1209,7 @@
             <w:noProof/>
             <w:webHidden/>
           </w:rPr>
-          <w:instrText xml:space="preserve"> PAGEREF _Toc242361267 \h </w:instrText>
+          <w:instrText xml:space="preserve"> PAGEREF _Toc242361995 \h </w:instrText>
         </w:r>
         <w:r>
           <w:rPr>
@@ -1253,7 +1253,7 @@
           <w:szCs w:val="24"/>
         </w:rPr>
       </w:pPr>
-      <w:hyperlink w:anchor="_Toc242361268" w:history="1">
+      <w:hyperlink w:anchor="_Toc242361996" w:history="1">
         <w:r>
           <w:rPr>
             <w:rStyle w:val="Hyperlink"/>
@@ -1280,7 +1280,7 @@
             <w:noProof/>
             <w:webHidden/>
           </w:rPr>
-          <w:instrText xml:space="preserve"> PAGEREF _Toc242361268 \h </w:instrText>
+          <w:instrText xml:space="preserve"> PAGEREF _Toc242361996 \h </w:instrText>
         </w:r>
         <w:r>
           <w:rPr>
@@ -1324,7 +1324,7 @@
           <w:szCs w:val="24"/>
         </w:rPr>
       </w:pPr>
-      <w:hyperlink w:anchor="_Toc242361269" w:history="1">
+      <w:hyperlink w:anchor="_Toc242361997" w:history="1">
         <w:r>
           <w:rPr>
             <w:rStyle w:val="Hyperlink"/>
@@ -1351,7 +1351,7 @@
             <w:noProof/>
             <w:webHidden/>
           </w:rPr>
-          <w:instrText xml:space="preserve"> PAGEREF _Toc242361269 \h </w:instrText>
+          <w:instrText xml:space="preserve"> PAGEREF _Toc242361997 \h </w:instrText>
         </w:r>
         <w:r>
           <w:rPr>
@@ -1395,7 +1395,7 @@
           <w:szCs w:val="24"/>
         </w:rPr>
       </w:pPr>
-      <w:hyperlink w:anchor="_Toc242361270" w:history="1">
+      <w:hyperlink w:anchor="_Toc242361998" w:history="1">
         <w:r>
           <w:rPr>
             <w:rStyle w:val="Hyperlink"/>
@@ -1422,7 +1422,7 @@
             <w:noProof/>
             <w:webHidden/>
           </w:rPr>
-          <w:instrText xml:space="preserve"> PAGEREF _Toc242361270 \h </w:instrText>
+          <w:instrText xml:space="preserve"> PAGEREF _Toc242361998 \h </w:instrText>
         </w:r>
         <w:r>
           <w:rPr>
@@ -1466,7 +1466,7 @@
           <w:szCs w:val="24"/>
         </w:rPr>
       </w:pPr>
-      <w:hyperlink w:anchor="_Toc242361271" w:history="1">
+      <w:hyperlink w:anchor="_Toc242361999" w:history="1">
         <w:r>
           <w:rPr>
             <w:rStyle w:val="Hyperlink"/>
@@ -1493,7 +1493,7 @@
             <w:noProof/>
             <w:webHidden/>
           </w:rPr>
-          <w:instrText xml:space="preserve"> PAGEREF _Toc242361271 \h </w:instrText>
+          <w:instrText xml:space="preserve"> PAGEREF _Toc242361999 \h </w:instrText>
         </w:r>
         <w:r>
           <w:rPr>
@@ -1537,7 +1537,7 @@
           <w:szCs w:val="24"/>
         </w:rPr>
       </w:pPr>
-      <w:hyperlink w:anchor="_Toc242361272" w:history="1">
+      <w:hyperlink w:anchor="_Toc242362000" w:history="1">
         <w:r>
           <w:rPr>
             <w:rStyle w:val="Hyperlink"/>
@@ -1564,7 +1564,7 @@
             <w:noProof/>
             <w:webHidden/>
           </w:rPr>
-          <w:instrText xml:space="preserve"> PAGEREF _Toc242361272 \h </w:instrText>
+          <w:instrText xml:space="preserve"> PAGEREF _Toc242362000 \h </w:instrText>
         </w:r>
         <w:r>
           <w:rPr>
@@ -1608,7 +1608,7 @@
           <w:szCs w:val="24"/>
         </w:rPr>
       </w:pPr>
-      <w:hyperlink w:anchor="_Toc242361273" w:history="1">
+      <w:hyperlink w:anchor="_Toc242362001" w:history="1">
         <w:r>
           <w:rPr>
             <w:rStyle w:val="Hyperlink"/>
@@ -1635,7 +1635,7 @@
             <w:noProof/>
             <w:webHidden/>
           </w:rPr>
-          <w:instrText xml:space="preserve"> PAGEREF _Toc242361273 \h </w:instrText>
+          <w:instrText xml:space="preserve"> PAGEREF _Toc242362001 \h </w:instrText>
         </w:r>
         <w:r>
           <w:rPr>
@@ -1690,7 +1690,7 @@
       <w:pPr>
         <w:pStyle w:val="Heading11"/>
       </w:pPr>
-      <w:bookmarkStart w:id="0" w:name="_Toc242361258"/>
+      <w:bookmarkStart w:id="0" w:name="_Toc242361986"/>
       <w:r>
         <w:lastRenderedPageBreak/>
         <w:t>PHẦN 1. THÔNG TIN CHUNG</w:t>
@@ -1701,7 +1701,7 @@
       <w:pPr>
         <w:pStyle w:val="Heading21"/>
       </w:pPr>
-      <w:bookmarkStart w:id="1" w:name="_Toc242361259"/>
+      <w:bookmarkStart w:id="1" w:name="_Toc242361987"/>
       <w:r>
         <w:t>1.1. ĐỀ TÀI VÀ PHẠM VI</w:t>
       </w:r>
@@ -1758,7 +1758,7 @@
       <w:pPr>
         <w:pStyle w:val="Heading21"/>
       </w:pPr>
-      <w:bookmarkStart w:id="2" w:name="_Toc242361260"/>
+      <w:bookmarkStart w:id="2" w:name="_Toc242361988"/>
       <w:r>
         <w:t>1.2. CHIA VIỆC THEO PHÂN HỆ</w:t>
       </w:r>
@@ -2334,7 +2334,7 @@
       <w:pPr>
         <w:pStyle w:val="Heading21"/>
       </w:pPr>
-      <w:bookmarkStart w:id="3" w:name="_Toc242361261"/>
+      <w:bookmarkStart w:id="3" w:name="_Toc242361989"/>
       <w:r>
         <w:lastRenderedPageBreak/>
         <w:t>1.3. TÀI NGUYÊN DÙNG CHUNG</w:t>
@@ -2367,7 +2367,7 @@
         <w:jc w:val="both"/>
       </w:pPr>
       <w:r>
-        <w:t>- Trang theo dõi tiến độ 10 tuần (tuần 7 tới tuần 16), mỗi việc có hạn và người chịu trách nhiệm; nhóm trưởng cập nhật sau mỗi buổi họp.</w:t>
+        <w:t>- Trang theo dõi tiến độ 9 tuần (tuần 8 tới tuần 16, đã lùi lịch ngày 07/10), mỗi việc có hạn và người chịu trách nhiệm; nhóm trưởng cập nhật sau mỗi buổi họp.</w:t>
       </w:r>
     </w:p>
     <w:p>
@@ -2402,7 +2402,7 @@
       <w:pPr>
         <w:pStyle w:val="Heading11"/>
       </w:pPr>
-      <w:bookmarkStart w:id="4" w:name="_Toc242361262"/>
+      <w:bookmarkStart w:id="4" w:name="_Toc242361990"/>
       <w:r>
         <w:t>PHẦN 2. TÌNH HÌNH THỰC HIỆN</w:t>
       </w:r>
@@ -2539,7 +2539,7 @@
               <w:rPr>
                 <w:sz w:val="24"/>
               </w:rPr>
-              <w:t>Phân tích đề cương, lập kế hoạch 10 tuần và trang theo dõi tiến độ</w:t>
+              <w:t>Phân tích đề cương, lập kế hoạch và trang theo dõi tiến độ</w:t>
             </w:r>
           </w:p>
         </w:tc>
@@ -3501,7 +3501,7 @@
       <w:pPr>
         <w:pStyle w:val="Heading11"/>
       </w:pPr>
-      <w:bookmarkStart w:id="5" w:name="_Toc242361263"/>
+      <w:bookmarkStart w:id="5" w:name="_Toc242361991"/>
       <w:r>
         <w:t>PHẦN 3. KẾT QUẢ ĐÃ CÓ</w:t>
       </w:r>
@@ -3511,7 +3511,7 @@
       <w:pPr>
         <w:pStyle w:val="Heading21"/>
       </w:pPr>
-      <w:bookmarkStart w:id="6" w:name="_Toc242361264"/>
+      <w:bookmarkStart w:id="6" w:name="_Toc242361992"/>
       <w:r>
         <w:t>3.1. PHÂN TÍCH YÊU CẦU BÀI TẬP NHÓM</w:t>
       </w:r>
@@ -3951,7 +3951,7 @@
       <w:pPr>
         <w:pStyle w:val="Heading21"/>
       </w:pPr>
-      <w:bookmarkStart w:id="7" w:name="_Toc242361265"/>
+      <w:bookmarkStart w:id="7" w:name="_Toc242361993"/>
       <w:r>
         <w:lastRenderedPageBreak/>
         <w:t>3.2. CHUẨN BỊ KHẢO SÁT</w:t>
@@ -4066,7 +4066,7 @@
       <w:pPr>
         <w:pStyle w:val="Heading21"/>
       </w:pPr>
-      <w:bookmarkStart w:id="8" w:name="_Toc242361266"/>
+      <w:bookmarkStart w:id="8" w:name="_Toc242361994"/>
       <w:r>
         <w:t>3.3. MÔ HÌNH HOÁ NGHIỆP VỤ (BẢN NHÁP)</w:t>
       </w:r>
@@ -4079,10 +4079,7 @@
         <w:jc w:val="both"/>
       </w:pPr>
       <w:r>
-        <w:t>Nhóm làm theo sáu bước mô hình hoá nghiệp vụ của chương 3: đánh giá hiện trạng tổ chức, xác định thuật ngữ, xác định tác nhân và use case nghiệp vụ, lập mô hình use case, đặc tả use case, xác định thừa tác viên và thực thể. Ký hiệu theo đúng bài giảng: tác nhân nghiệp vụ ghi «business actor», use case nghiệp vụ là elip có gạch chéo, thừa tác viên giao tiếp với môi trường vẽ hình biên, thừa tác viên làm việc bên trong vẽ hình tròn có người, thực thể nghiệp vụ vẽ hình tròn có gạch dưới. Phần đánh giá hiện trạ</w:t>
-      </w:r>
-      <w:r>
-        <w:t>ng (sơ đồ tổ chức, đối tượng liên quan, giới hạn hệ thống, bảng vấn đề) và bảng thuật ngữ đã có khung, đang là giả định và sẽ viết lại sau buổi phỏng vấn.</w:t>
+        <w:t>Nhóm làm theo sáu bước mô hình hoá nghiệp vụ của chương 3: đánh giá hiện trạng tổ chức, xác định thuật ngữ, xác định tác nhân và use case nghiệp vụ, lập mô hình use case, đặc tả use case, xác định thừa tác viên và thực thể. Ký hiệu theo đúng bài giảng: tác nhân nghiệp vụ ghi «business actor», use case nghiệp vụ là elip có gạch chéo, thừa tác viên giao tiếp với môi trường vẽ hình biên, thừa tác viên làm việc bên trong vẽ hình tròn có người, thực thể nghiệp vụ vẽ hình tròn có gạch dưới. Phần đánh giá hiện trạng (sơ đồ tổ chức, đối tượng liên quan, giới hạn hệ thống, bảng vấn đề) và bảng thuật ngữ đã có khung, đang là giả định và sẽ viết lại sau buổi phỏng vấn.</w:t>
       </w:r>
     </w:p>
     <w:p>
@@ -5633,7 +5630,7 @@
       <w:pPr>
         <w:pStyle w:val="Heading21"/>
       </w:pPr>
-      <w:bookmarkStart w:id="9" w:name="_Toc242361267"/>
+      <w:bookmarkStart w:id="9" w:name="_Toc242361995"/>
       <w:r>
         <w:t>3.4. MÔ HÌNH HOÁ CHỨC NĂNG (BẢN NHÁP)</w:t>
       </w:r>
@@ -6312,7 +6309,7 @@
       <w:pPr>
         <w:pStyle w:val="Heading21"/>
       </w:pPr>
-      <w:bookmarkStart w:id="10" w:name="_Toc242361268"/>
+      <w:bookmarkStart w:id="10" w:name="_Toc242361996"/>
       <w:r>
         <w:t>3.5. MÔ HÌNH HOÁ CẤU TRÚC (KHUNG DÙNG CHUNG)</w:t>
       </w:r>
@@ -7138,7 +7135,7 @@
       <w:pPr>
         <w:pStyle w:val="Heading21"/>
       </w:pPr>
-      <w:bookmarkStart w:id="11" w:name="_Toc242361269"/>
+      <w:bookmarkStart w:id="11" w:name="_Toc242361997"/>
       <w:r>
         <w:t>3.6. MẪU ĐẶC TẢ VÀ VÍ DỤ</w:t>
       </w:r>
@@ -7751,7 +7748,7 @@
       <w:pPr>
         <w:pStyle w:val="Heading21"/>
       </w:pPr>
-      <w:bookmarkStart w:id="12" w:name="_Toc242361270"/>
+      <w:bookmarkStart w:id="12" w:name="_Toc242361998"/>
       <w:r>
         <w:t>3.7. BỘ GIAO DIỆN CHUNG</w:t>
       </w:r>
@@ -7901,7 +7898,7 @@
       <w:pPr>
         <w:pStyle w:val="Heading11"/>
       </w:pPr>
-      <w:bookmarkStart w:id="13" w:name="_Toc242361271"/>
+      <w:bookmarkStart w:id="13" w:name="_Toc242361999"/>
       <w:r>
         <w:t>PHẦN 4. KẾ HOẠCH TIẾP THEO</w:t>
       </w:r>
@@ -8672,7 +8669,7 @@
       <w:pPr>
         <w:pStyle w:val="Heading11"/>
       </w:pPr>
-      <w:bookmarkStart w:id="14" w:name="_Toc242361272"/>
+      <w:bookmarkStart w:id="14" w:name="_Toc242362000"/>
       <w:r>
         <w:t>PHẦN 5. KHÓ KHĂN VÀ ĐỀ XUẤT</w:t>
       </w:r>
@@ -8720,7 +8717,7 @@
       <w:pPr>
         <w:pStyle w:val="Heading11"/>
       </w:pPr>
-      <w:bookmarkStart w:id="15" w:name="_Toc242361273"/>
+      <w:bookmarkStart w:id="15" w:name="_Toc242362001"/>
       <w:r>
         <w:t>TÀI LIỆU THAM KHẢO</w:t>
       </w:r>
@@ -8736,8 +8733,6 @@
       </w:r>
       <w:r>
         <w:tab/>
-      </w:r>
-      <w:r>
         <w:t>Trường Đại học Công Thương TP.HCM, Khoa Công nghệ thông tin, Đề cương học phần Phân tích thiết kế hệ thống thông tin (mã 0101003615), bản cập nhật 22/01/2026.</w:t>
       </w:r>
     </w:p>
@@ -8764,8 +8759,6 @@
       </w:r>
       <w:r>
         <w:tab/>
-      </w:r>
-      <w:r>
         <w:t>Phạm Nguyễn Cương, Nguyễn Trần Minh Thư, Hồ Bảo Quốc, Giáo trình Phân tích thiết kế hệ thống thông tin theo hướng đối tượng, NXB Khoa học và Kỹ thuật, 2016.</w:t>
       </w:r>
     </w:p>

</xml_diff>